<commit_message>
Updated docs, added README, Changelog, and some structure for future use
</commit_message>
<xml_diff>
--- a/docs/Architekturuebersicht.docx
+++ b/docs/Architekturuebersicht.docx
@@ -45,7 +45,7 @@
           <w:sz w:val="22"/>
           <w:szCs w:val="22"/>
         </w:rPr>
-        <w:t xml:space="preserve">Version 1.0 – initiale Architektur</w:t>
+        <w:t xml:space="preserve">Version 1.2 – Backup-Strategie ergänzt</w:t>
       </w:r>
     </w:p>
     <w:p>
@@ -171,7 +171,7 @@
           <w:sz w:val="20"/>
           <w:szCs w:val="20"/>
         </w:rPr>
-        <w:t xml:space="preserve">                            │ HTTPS</w:t>
+        <w:t xml:space="preserve">                            │ HTTPS :443</w:t>
       </w:r>
     </w:p>
     <w:p>
@@ -199,7 +199,7 @@
           <w:sz w:val="20"/>
           <w:szCs w:val="20"/>
         </w:rPr>
-        <w:t xml:space="preserve">│                  VPS (Hetzner / Infomaniak)             │</w:t>
+        <w:t xml:space="preserve">│          VPS — Infomaniak (Genf / Zürich)               │</w:t>
       </w:r>
     </w:p>
     <w:p>
@@ -241,7 +241,7 @@
           <w:sz w:val="20"/>
           <w:szCs w:val="20"/>
         </w:rPr>
-        <w:t xml:space="preserve">│  │  nginx (Reverse Proxy)                           │   │</w:t>
+        <w:t xml:space="preserve">│  │  Docker Compose                                  │   │</w:t>
       </w:r>
     </w:p>
     <w:p>
@@ -255,7 +255,7 @@
           <w:sz w:val="20"/>
           <w:szCs w:val="20"/>
         </w:rPr>
-        <w:t xml:space="preserve">│  │  • TLS-Terminierung (Let's Encrypt)              │   │</w:t>
+        <w:t xml:space="preserve">│  │                                                  │   │</w:t>
       </w:r>
     </w:p>
     <w:p>
@@ -269,7 +269,7 @@
           <w:sz w:val="20"/>
           <w:szCs w:val="20"/>
         </w:rPr>
-        <w:t xml:space="preserve">│  │  • Statische Assets (CSS, JS, Bilder)            │   │</w:t>
+        <w:t xml:space="preserve">│  │  ┌────────────────────────────────────────────┐  │   │</w:t>
       </w:r>
     </w:p>
     <w:p>
@@ -283,7 +283,7 @@
           <w:sz w:val="20"/>
           <w:szCs w:val="20"/>
         </w:rPr>
-        <w:t xml:space="preserve">│  └─────────────────────┬────────────────────────────┘   │</w:t>
+        <w:t xml:space="preserve">│  │  │  Container: nginx                          │  │   │</w:t>
       </w:r>
     </w:p>
     <w:p>
@@ -297,7 +297,7 @@
           <w:sz w:val="20"/>
           <w:szCs w:val="20"/>
         </w:rPr>
-        <w:t xml:space="preserve">│                        │ HTTP (intern)                  │</w:t>
+        <w:t xml:space="preserve">│  │  │  • TLS-Terminierung (Let's Encrypt)        │  │   │</w:t>
       </w:r>
     </w:p>
     <w:p>
@@ -311,7 +311,7 @@
           <w:sz w:val="20"/>
           <w:szCs w:val="20"/>
         </w:rPr>
-        <w:t xml:space="preserve">│  ┌─────────────────────▼────────────────────────────┐   │</w:t>
+        <w:t xml:space="preserve">│  │  │  • Statische Assets                        │  │   │</w:t>
       </w:r>
     </w:p>
     <w:p>
@@ -325,7 +325,7 @@
           <w:sz w:val="20"/>
           <w:szCs w:val="20"/>
         </w:rPr>
-        <w:t xml:space="preserve">│  │  FastAPI (Python)                                │   │</w:t>
+        <w:t xml:space="preserve">│  │  └───────────────────┬────────────────────────┘  │   │</w:t>
       </w:r>
     </w:p>
     <w:p>
@@ -339,7 +339,7 @@
           <w:sz w:val="20"/>
           <w:szCs w:val="20"/>
         </w:rPr>
-        <w:t xml:space="preserve">│  │  • Jinja2 SSR (HTML-Templates)                  │   │</w:t>
+        <w:t xml:space="preserve">│  │                      │ HTTP :8000 (intern)        │   │</w:t>
       </w:r>
     </w:p>
     <w:p>
@@ -353,7 +353,7 @@
           <w:sz w:val="20"/>
           <w:szCs w:val="20"/>
         </w:rPr>
-        <w:t xml:space="preserve">│  │  • HTMX-Endpunkte (partielle HTML-Fragmente)    │   │</w:t>
+        <w:t xml:space="preserve">│  │  ┌───────────────────▼────────────────────────┐  │   │</w:t>
       </w:r>
     </w:p>
     <w:p>
@@ -367,7 +367,7 @@
           <w:sz w:val="20"/>
           <w:szCs w:val="20"/>
         </w:rPr>
-        <w:t xml:space="preserve">│  │  • REST-API (JSON für JS-Komponenten)           │   │</w:t>
+        <w:t xml:space="preserve">│  │  │  Container: app (FastAPI + uvicorn)        │  │   │</w:t>
       </w:r>
     </w:p>
     <w:p>
@@ -381,7 +381,7 @@
           <w:sz w:val="20"/>
           <w:szCs w:val="20"/>
         </w:rPr>
-        <w:t xml:space="preserve">│  │  • JWT-Authentifizierung                        │   │</w:t>
+        <w:t xml:space="preserve">│  │  │  • Jinja2 SSR + HTMX-Endpunkte            │  │   │</w:t>
       </w:r>
     </w:p>
     <w:p>
@@ -395,7 +395,7 @@
           <w:sz w:val="20"/>
           <w:szCs w:val="20"/>
         </w:rPr>
-        <w:t xml:space="preserve">│  │  • RBAC / Geschäftslogik                        │   │</w:t>
+        <w:t xml:space="preserve">│  │  │  • JWT-Auth, RBAC, Geschäftslogik         │  │   │</w:t>
       </w:r>
     </w:p>
     <w:p>
@@ -409,7 +409,7 @@
           <w:sz w:val="20"/>
           <w:szCs w:val="20"/>
         </w:rPr>
-        <w:t xml:space="preserve">│  │  • Audit Log                                    │   │</w:t>
+        <w:t xml:space="preserve">│  │  │  • Audit Log                               │  │   │</w:t>
       </w:r>
     </w:p>
     <w:p>
@@ -423,7 +423,7 @@
           <w:sz w:val="20"/>
           <w:szCs w:val="20"/>
         </w:rPr>
-        <w:t xml:space="preserve">│  └─────────────────────┬────────────────────────────┘   │</w:t>
+        <w:t xml:space="preserve">│  │  └───────────────────┬────────────────────────┘  │   │</w:t>
       </w:r>
     </w:p>
     <w:p>
@@ -437,7 +437,7 @@
           <w:sz w:val="20"/>
           <w:szCs w:val="20"/>
         </w:rPr>
-        <w:t xml:space="preserve">│                        │ asyncpg / SQLAlchemy           │</w:t>
+        <w:t xml:space="preserve">│  │                      │ asyncpg :5432 (intern)     │   │</w:t>
       </w:r>
     </w:p>
     <w:p>
@@ -451,7 +451,7 @@
           <w:sz w:val="20"/>
           <w:szCs w:val="20"/>
         </w:rPr>
-        <w:t xml:space="preserve">│  ┌─────────────────────▼────────────────────────────┐   │</w:t>
+        <w:t xml:space="preserve">│  │  ┌───────────────────▼────────────────────────┐  │   │</w:t>
       </w:r>
     </w:p>
     <w:p>
@@ -465,7 +465,7 @@
           <w:sz w:val="20"/>
           <w:szCs w:val="20"/>
         </w:rPr>
-        <w:t xml:space="preserve">│  │  PostgreSQL                                      │   │</w:t>
+        <w:t xml:space="preserve">│  │  │  Container: db (PostgreSQL)                │  │   │</w:t>
       </w:r>
     </w:p>
     <w:p>
@@ -479,7 +479,7 @@
           <w:sz w:val="20"/>
           <w:szCs w:val="20"/>
         </w:rPr>
-        <w:t xml:space="preserve">│  │  • 17 Tabellen + GiST-Index                     │   │</w:t>
+        <w:t xml:space="preserve">│  │  │  • 17 Tabellen, GiST-Index                │  │   │</w:t>
       </w:r>
     </w:p>
     <w:p>
@@ -493,7 +493,7 @@
           <w:sz w:val="20"/>
           <w:szCs w:val="20"/>
         </w:rPr>
-        <w:t xml:space="preserve">│  │  • DB-Funktionen (Konflikt, Blackout, Anon.)    │   │</w:t>
+        <w:t xml:space="preserve">│  │  │  • Volume: /var/lib/postgresql/data        │  │   │</w:t>
       </w:r>
     </w:p>
     <w:p>
@@ -507,7 +507,7 @@
           <w:sz w:val="20"/>
           <w:szCs w:val="20"/>
         </w:rPr>
-        <w:t xml:space="preserve">│  └──────────────────────────────────────────────────┘   │</w:t>
+        <w:t xml:space="preserve">│  │  └────────────────────────────────────────────┘  │   │</w:t>
       </w:r>
     </w:p>
     <w:p>
@@ -521,7 +521,7 @@
           <w:sz w:val="20"/>
           <w:szCs w:val="20"/>
         </w:rPr>
-        <w:t xml:space="preserve">│                                                         │</w:t>
+        <w:t xml:space="preserve">│  │                                                  │   │</w:t>
       </w:r>
     </w:p>
     <w:p>
@@ -535,7 +535,7 @@
           <w:sz w:val="20"/>
           <w:szCs w:val="20"/>
         </w:rPr>
-        <w:t xml:space="preserve">│  ┌──────────────────────────────────────────────────┐   │</w:t>
+        <w:t xml:space="preserve">│  │  Cron (Host): jährlich → Archivierungsjob        │   │</w:t>
       </w:r>
     </w:p>
     <w:p>
@@ -549,77 +549,7 @@
           <w:sz w:val="20"/>
           <w:szCs w:val="20"/>
         </w:rPr>
-        <w:t xml:space="preserve">│  │  Cron-Job (jährlich)                             │   │</w:t>
-      </w:r>
-    </w:p>
-    <w:p>
-      <w:pPr>
-        <w:spacing w:after="60"/>
-        <w:ind w:left="480"/>
-      </w:pPr>
-      <w:r>
-        <w:rPr>
-          <w:rFonts w:ascii="Courier New" w:cs="Courier New" w:eastAsia="Courier New" w:hAnsi="Courier New"/>
-          <w:sz w:val="20"/>
-          <w:szCs w:val="20"/>
-        </w:rPr>
-        <w:t xml:space="preserve">│  │  Export (anon.) → Verifizieren → Löschen        │   │</w:t>
-      </w:r>
-    </w:p>
-    <w:p>
-      <w:pPr>
-        <w:spacing w:after="60"/>
-        <w:ind w:left="480"/>
-      </w:pPr>
-      <w:r>
-        <w:rPr>
-          <w:rFonts w:ascii="Courier New" w:cs="Courier New" w:eastAsia="Courier New" w:hAnsi="Courier New"/>
-          <w:sz w:val="20"/>
-          <w:szCs w:val="20"/>
-        </w:rPr>
-        <w:t xml:space="preserve">│  └──────────────────────────────────────────────────┘   │</w:t>
-      </w:r>
-    </w:p>
-    <w:p>
-      <w:pPr>
-        <w:spacing w:after="60"/>
-        <w:ind w:left="480"/>
-      </w:pPr>
-      <w:r>
-        <w:rPr>
-          <w:rFonts w:ascii="Courier New" w:cs="Courier New" w:eastAsia="Courier New" w:hAnsi="Courier New"/>
-          <w:sz w:val="20"/>
-          <w:szCs w:val="20"/>
-        </w:rPr>
-        <w:t xml:space="preserve">│                                                         │</w:t>
-      </w:r>
-    </w:p>
-    <w:p>
-      <w:pPr>
-        <w:spacing w:after="60"/>
-        <w:ind w:left="480"/>
-      </w:pPr>
-      <w:r>
-        <w:rPr>
-          <w:rFonts w:ascii="Courier New" w:cs="Courier New" w:eastAsia="Courier New" w:hAnsi="Courier New"/>
-          <w:sz w:val="20"/>
-          <w:szCs w:val="20"/>
-        </w:rPr>
-        <w:t xml:space="preserve">│  ┌──────────────────────────────────────────────────┐   │</w:t>
-      </w:r>
-    </w:p>
-    <w:p>
-      <w:pPr>
-        <w:spacing w:after="60"/>
-        <w:ind w:left="480"/>
-      </w:pPr>
-      <w:r>
-        <w:rPr>
-          <w:rFonts w:ascii="Courier New" w:cs="Courier New" w:eastAsia="Courier New" w:hAnsi="Courier New"/>
-          <w:sz w:val="20"/>
-          <w:szCs w:val="20"/>
-        </w:rPr>
-        <w:t xml:space="preserve">│  │  Backup (täglich, verschlüsselt, 90 Tage)        │   │</w:t>
+        <w:t xml:space="preserve">│  │  Backup (Host): täglich → verschlüsselt, 90 Tage │   │</w:t>
       </w:r>
     </w:p>
     <w:p>
@@ -824,7 +754,7 @@
                 <w:sz w:val="20"/>
                 <w:szCs w:val="20"/>
               </w:rPr>
-              <w:t xml:space="preserve">Hetzner (DE) oder Infomaniak (CH) — TBD</w:t>
+              <w:t xml:space="preserve">Infomaniak (CH) — Genf/Zürich, ISO 27001, DSG-konform, mitarbeitereigen</w:t>
             </w:r>
           </w:p>
         </w:tc>
@@ -4384,7 +4314,7 @@
           <w:sz w:val="28"/>
           <w:szCs w:val="28"/>
         </w:rPr>
-        <w:t xml:space="preserve">6. Deployment-Übersicht</w:t>
+        <w:t xml:space="preserve">6. Deployment</w:t>
       </w:r>
     </w:p>
     <w:p>
@@ -4400,7 +4330,417 @@
           <w:sz w:val="24"/>
           <w:szCs w:val="24"/>
         </w:rPr>
-        <w:t xml:space="preserve">6.1 Prozesse auf dem VPS</w:t>
+        <w:t xml:space="preserve">6.1 Docker Compose — Struktur</w:t>
+      </w:r>
+    </w:p>
+    <w:p>
+      <w:pPr>
+        <w:spacing w:after="120"/>
+      </w:pPr>
+      <w:r>
+        <w:rPr>
+          <w:sz w:val="22"/>
+          <w:szCs w:val="22"/>
+        </w:rPr>
+        <w:t xml:space="preserve">Das System besteht aus drei Containern, orchestriert via Docker Compose. Cron-Job und Backup laufen als Host-Prozesse (systemd timer) und greifen auf die Docker-Volumes zu.</w:t>
+      </w:r>
+    </w:p>
+    <w:tbl>
+      <w:tblPr>
+        <w:tblW w:type="dxa" w:w="9026"/>
+        <w:tblBorders>
+          <w:top w:val="single" w:color="auto" w:sz="4"/>
+          <w:left w:val="single" w:color="auto" w:sz="4"/>
+          <w:bottom w:val="single" w:color="auto" w:sz="4"/>
+          <w:right w:val="single" w:color="auto" w:sz="4"/>
+          <w:insideH w:val="single" w:color="auto" w:sz="4"/>
+          <w:insideV w:val="single" w:color="auto" w:sz="4"/>
+        </w:tblBorders>
+      </w:tblPr>
+      <w:tblGrid>
+        <w:gridCol w:w="1400"/>
+        <w:gridCol w:w="3000"/>
+        <w:gridCol w:w="4626"/>
+      </w:tblGrid>
+      <w:tr>
+        <w:tc>
+          <w:tcPr>
+            <w:tcW w:type="dxa" w:w="1400"/>
+            <w:tcBorders>
+              <w:top w:val="single" w:color="BBCCDD" w:sz="1"/>
+              <w:left w:val="single" w:color="BBCCDD" w:sz="1"/>
+              <w:bottom w:val="single" w:color="BBCCDD" w:sz="1"/>
+              <w:right w:val="single" w:color="BBCCDD" w:sz="1"/>
+            </w:tcBorders>
+            <w:shd w:fill="DDE8F0" w:val="clear"/>
+            <w:tcMar>
+              <w:top w:type="dxa" w:w="80"/>
+              <w:left w:type="dxa" w:w="120"/>
+              <w:bottom w:type="dxa" w:w="80"/>
+              <w:right w:type="dxa" w:w="120"/>
+            </w:tcMar>
+          </w:tcPr>
+          <w:p>
+            <w:r>
+              <w:rPr>
+                <w:b/>
+                <w:bCs/>
+                <w:sz w:val="20"/>
+                <w:szCs w:val="20"/>
+              </w:rPr>
+              <w:t xml:space="preserve">Container</w:t>
+            </w:r>
+          </w:p>
+        </w:tc>
+        <w:tc>
+          <w:tcPr>
+            <w:tcW w:type="dxa" w:w="3000"/>
+            <w:tcBorders>
+              <w:top w:val="single" w:color="BBCCDD" w:sz="1"/>
+              <w:left w:val="single" w:color="BBCCDD" w:sz="1"/>
+              <w:bottom w:val="single" w:color="BBCCDD" w:sz="1"/>
+              <w:right w:val="single" w:color="BBCCDD" w:sz="1"/>
+            </w:tcBorders>
+            <w:shd w:fill="DDE8F0" w:val="clear"/>
+            <w:tcMar>
+              <w:top w:type="dxa" w:w="80"/>
+              <w:left w:type="dxa" w:w="120"/>
+              <w:bottom w:type="dxa" w:w="80"/>
+              <w:right w:type="dxa" w:w="120"/>
+            </w:tcMar>
+          </w:tcPr>
+          <w:p>
+            <w:r>
+              <w:rPr>
+                <w:b/>
+                <w:bCs/>
+                <w:sz w:val="20"/>
+                <w:szCs w:val="20"/>
+              </w:rPr>
+              <w:t xml:space="preserve">Image</w:t>
+            </w:r>
+          </w:p>
+        </w:tc>
+        <w:tc>
+          <w:tcPr>
+            <w:tcW w:type="dxa" w:w="4626"/>
+            <w:tcBorders>
+              <w:top w:val="single" w:color="BBCCDD" w:sz="1"/>
+              <w:left w:val="single" w:color="BBCCDD" w:sz="1"/>
+              <w:bottom w:val="single" w:color="BBCCDD" w:sz="1"/>
+              <w:right w:val="single" w:color="BBCCDD" w:sz="1"/>
+            </w:tcBorders>
+            <w:shd w:fill="DDE8F0" w:val="clear"/>
+            <w:tcMar>
+              <w:top w:type="dxa" w:w="80"/>
+              <w:left w:type="dxa" w:w="120"/>
+              <w:bottom w:type="dxa" w:w="80"/>
+              <w:right w:type="dxa" w:w="120"/>
+            </w:tcMar>
+          </w:tcPr>
+          <w:p>
+            <w:r>
+              <w:rPr>
+                <w:b/>
+                <w:bCs/>
+                <w:sz w:val="20"/>
+                <w:szCs w:val="20"/>
+              </w:rPr>
+              <w:t xml:space="preserve">Aufgabe</w:t>
+            </w:r>
+          </w:p>
+        </w:tc>
+      </w:tr>
+      <w:tr>
+        <w:tc>
+          <w:tcPr>
+            <w:tcW w:type="dxa" w:w="1400"/>
+            <w:tcBorders>
+              <w:top w:val="single" w:color="BBCCDD" w:sz="1"/>
+              <w:left w:val="single" w:color="BBCCDD" w:sz="1"/>
+              <w:bottom w:val="single" w:color="BBCCDD" w:sz="1"/>
+              <w:right w:val="single" w:color="BBCCDD" w:sz="1"/>
+            </w:tcBorders>
+            <w:shd w:fill="FFFFFF" w:val="clear"/>
+            <w:tcMar>
+              <w:top w:type="dxa" w:w="80"/>
+              <w:left w:type="dxa" w:w="120"/>
+              <w:bottom w:type="dxa" w:w="80"/>
+              <w:right w:type="dxa" w:w="120"/>
+            </w:tcMar>
+          </w:tcPr>
+          <w:p>
+            <w:r>
+              <w:rPr>
+                <w:b w:val="false"/>
+                <w:bCs w:val="false"/>
+                <w:sz w:val="20"/>
+                <w:szCs w:val="20"/>
+              </w:rPr>
+              <w:t xml:space="preserve">nginx</w:t>
+            </w:r>
+          </w:p>
+        </w:tc>
+        <w:tc>
+          <w:tcPr>
+            <w:tcW w:type="dxa" w:w="3000"/>
+            <w:tcBorders>
+              <w:top w:val="single" w:color="BBCCDD" w:sz="1"/>
+              <w:left w:val="single" w:color="BBCCDD" w:sz="1"/>
+              <w:bottom w:val="single" w:color="BBCCDD" w:sz="1"/>
+              <w:right w:val="single" w:color="BBCCDD" w:sz="1"/>
+            </w:tcBorders>
+            <w:shd w:fill="FFFFFF" w:val="clear"/>
+            <w:tcMar>
+              <w:top w:type="dxa" w:w="80"/>
+              <w:left w:type="dxa" w:w="120"/>
+              <w:bottom w:type="dxa" w:w="80"/>
+              <w:right w:type="dxa" w:w="120"/>
+            </w:tcMar>
+          </w:tcPr>
+          <w:p>
+            <w:r>
+              <w:rPr>
+                <w:b w:val="false"/>
+                <w:bCs w:val="false"/>
+                <w:sz w:val="20"/>
+                <w:szCs w:val="20"/>
+              </w:rPr>
+              <w:t xml:space="preserve">nginx:alpine</w:t>
+            </w:r>
+          </w:p>
+        </w:tc>
+        <w:tc>
+          <w:tcPr>
+            <w:tcW w:type="dxa" w:w="4626"/>
+            <w:tcBorders>
+              <w:top w:val="single" w:color="BBCCDD" w:sz="1"/>
+              <w:left w:val="single" w:color="BBCCDD" w:sz="1"/>
+              <w:bottom w:val="single" w:color="BBCCDD" w:sz="1"/>
+              <w:right w:val="single" w:color="BBCCDD" w:sz="1"/>
+            </w:tcBorders>
+            <w:shd w:fill="FFFFFF" w:val="clear"/>
+            <w:tcMar>
+              <w:top w:type="dxa" w:w="80"/>
+              <w:left w:type="dxa" w:w="120"/>
+              <w:bottom w:type="dxa" w:w="80"/>
+              <w:right w:type="dxa" w:w="120"/>
+            </w:tcMar>
+          </w:tcPr>
+          <w:p>
+            <w:r>
+              <w:rPr>
+                <w:b w:val="false"/>
+                <w:bCs w:val="false"/>
+                <w:sz w:val="20"/>
+                <w:szCs w:val="20"/>
+              </w:rPr>
+              <w:t xml:space="preserve">TLS-Terminierung, statische Assets, Reverse Proxy</w:t>
+            </w:r>
+          </w:p>
+        </w:tc>
+      </w:tr>
+      <w:tr>
+        <w:tc>
+          <w:tcPr>
+            <w:tcW w:type="dxa" w:w="1400"/>
+            <w:tcBorders>
+              <w:top w:val="single" w:color="BBCCDD" w:sz="1"/>
+              <w:left w:val="single" w:color="BBCCDD" w:sz="1"/>
+              <w:bottom w:val="single" w:color="BBCCDD" w:sz="1"/>
+              <w:right w:val="single" w:color="BBCCDD" w:sz="1"/>
+            </w:tcBorders>
+            <w:shd w:fill="F5F8FB" w:val="clear"/>
+            <w:tcMar>
+              <w:top w:type="dxa" w:w="80"/>
+              <w:left w:type="dxa" w:w="120"/>
+              <w:bottom w:type="dxa" w:w="80"/>
+              <w:right w:type="dxa" w:w="120"/>
+            </w:tcMar>
+          </w:tcPr>
+          <w:p>
+            <w:r>
+              <w:rPr>
+                <w:b w:val="false"/>
+                <w:bCs w:val="false"/>
+                <w:sz w:val="20"/>
+                <w:szCs w:val="20"/>
+              </w:rPr>
+              <w:t xml:space="preserve">app</w:t>
+            </w:r>
+          </w:p>
+        </w:tc>
+        <w:tc>
+          <w:tcPr>
+            <w:tcW w:type="dxa" w:w="3000"/>
+            <w:tcBorders>
+              <w:top w:val="single" w:color="BBCCDD" w:sz="1"/>
+              <w:left w:val="single" w:color="BBCCDD" w:sz="1"/>
+              <w:bottom w:val="single" w:color="BBCCDD" w:sz="1"/>
+              <w:right w:val="single" w:color="BBCCDD" w:sz="1"/>
+            </w:tcBorders>
+            <w:shd w:fill="F5F8FB" w:val="clear"/>
+            <w:tcMar>
+              <w:top w:type="dxa" w:w="80"/>
+              <w:left w:type="dxa" w:w="120"/>
+              <w:bottom w:type="dxa" w:w="80"/>
+              <w:right w:type="dxa" w:w="120"/>
+            </w:tcMar>
+          </w:tcPr>
+          <w:p>
+            <w:r>
+              <w:rPr>
+                <w:b w:val="false"/>
+                <w:bCs w:val="false"/>
+                <w:sz w:val="20"/>
+                <w:szCs w:val="20"/>
+              </w:rPr>
+              <w:t xml:space="preserve">Eigenes Image (Python 3.12-slim)</w:t>
+            </w:r>
+          </w:p>
+        </w:tc>
+        <w:tc>
+          <w:tcPr>
+            <w:tcW w:type="dxa" w:w="4626"/>
+            <w:tcBorders>
+              <w:top w:val="single" w:color="BBCCDD" w:sz="1"/>
+              <w:left w:val="single" w:color="BBCCDD" w:sz="1"/>
+              <w:bottom w:val="single" w:color="BBCCDD" w:sz="1"/>
+              <w:right w:val="single" w:color="BBCCDD" w:sz="1"/>
+            </w:tcBorders>
+            <w:shd w:fill="F5F8FB" w:val="clear"/>
+            <w:tcMar>
+              <w:top w:type="dxa" w:w="80"/>
+              <w:left w:type="dxa" w:w="120"/>
+              <w:bottom w:type="dxa" w:w="80"/>
+              <w:right w:type="dxa" w:w="120"/>
+            </w:tcMar>
+          </w:tcPr>
+          <w:p>
+            <w:r>
+              <w:rPr>
+                <w:b w:val="false"/>
+                <w:bCs w:val="false"/>
+                <w:sz w:val="20"/>
+                <w:szCs w:val="20"/>
+              </w:rPr>
+              <w:t xml:space="preserve">FastAPI + uvicorn, Jinja2, HTMX-Endpunkte</w:t>
+            </w:r>
+          </w:p>
+        </w:tc>
+      </w:tr>
+      <w:tr>
+        <w:tc>
+          <w:tcPr>
+            <w:tcW w:type="dxa" w:w="1400"/>
+            <w:tcBorders>
+              <w:top w:val="single" w:color="BBCCDD" w:sz="1"/>
+              <w:left w:val="single" w:color="BBCCDD" w:sz="1"/>
+              <w:bottom w:val="single" w:color="BBCCDD" w:sz="1"/>
+              <w:right w:val="single" w:color="BBCCDD" w:sz="1"/>
+            </w:tcBorders>
+            <w:shd w:fill="FFFFFF" w:val="clear"/>
+            <w:tcMar>
+              <w:top w:type="dxa" w:w="80"/>
+              <w:left w:type="dxa" w:w="120"/>
+              <w:bottom w:type="dxa" w:w="80"/>
+              <w:right w:type="dxa" w:w="120"/>
+            </w:tcMar>
+          </w:tcPr>
+          <w:p>
+            <w:r>
+              <w:rPr>
+                <w:b w:val="false"/>
+                <w:bCs w:val="false"/>
+                <w:sz w:val="20"/>
+                <w:szCs w:val="20"/>
+              </w:rPr>
+              <w:t xml:space="preserve">db</w:t>
+            </w:r>
+          </w:p>
+        </w:tc>
+        <w:tc>
+          <w:tcPr>
+            <w:tcW w:type="dxa" w:w="3000"/>
+            <w:tcBorders>
+              <w:top w:val="single" w:color="BBCCDD" w:sz="1"/>
+              <w:left w:val="single" w:color="BBCCDD" w:sz="1"/>
+              <w:bottom w:val="single" w:color="BBCCDD" w:sz="1"/>
+              <w:right w:val="single" w:color="BBCCDD" w:sz="1"/>
+            </w:tcBorders>
+            <w:shd w:fill="FFFFFF" w:val="clear"/>
+            <w:tcMar>
+              <w:top w:type="dxa" w:w="80"/>
+              <w:left w:type="dxa" w:w="120"/>
+              <w:bottom w:type="dxa" w:w="80"/>
+              <w:right w:type="dxa" w:w="120"/>
+            </w:tcMar>
+          </w:tcPr>
+          <w:p>
+            <w:r>
+              <w:rPr>
+                <w:b w:val="false"/>
+                <w:bCs w:val="false"/>
+                <w:sz w:val="20"/>
+                <w:szCs w:val="20"/>
+              </w:rPr>
+              <w:t xml:space="preserve">postgres:16-alpine</w:t>
+            </w:r>
+          </w:p>
+        </w:tc>
+        <w:tc>
+          <w:tcPr>
+            <w:tcW w:type="dxa" w:w="4626"/>
+            <w:tcBorders>
+              <w:top w:val="single" w:color="BBCCDD" w:sz="1"/>
+              <w:left w:val="single" w:color="BBCCDD" w:sz="1"/>
+              <w:bottom w:val="single" w:color="BBCCDD" w:sz="1"/>
+              <w:right w:val="single" w:color="BBCCDD" w:sz="1"/>
+            </w:tcBorders>
+            <w:shd w:fill="FFFFFF" w:val="clear"/>
+            <w:tcMar>
+              <w:top w:type="dxa" w:w="80"/>
+              <w:left w:type="dxa" w:w="120"/>
+              <w:bottom w:type="dxa" w:w="80"/>
+              <w:right w:type="dxa" w:w="120"/>
+            </w:tcMar>
+          </w:tcPr>
+          <w:p>
+            <w:r>
+              <w:rPr>
+                <w:b w:val="false"/>
+                <w:bCs w:val="false"/>
+                <w:sz w:val="20"/>
+                <w:szCs w:val="20"/>
+              </w:rPr>
+              <w:t xml:space="preserve">PostgreSQL, persistentes Volume</w:t>
+            </w:r>
+          </w:p>
+        </w:tc>
+      </w:tr>
+    </w:tbl>
+    <w:p>
+      <w:pPr>
+        <w:spacing w:after="80"/>
+      </w:pPr>
+      <w:r>
+        <w:t xml:space="preserve"/>
+      </w:r>
+    </w:p>
+    <w:p>
+      <w:pPr>
+        <w:pStyle w:val="Heading2"/>
+        <w:spacing w:after="80" w:before="200"/>
+      </w:pPr>
+      <w:r>
+        <w:rPr>
+          <w:b/>
+          <w:bCs/>
+          <w:color w:val="3A6B8A"/>
+          <w:sz w:val="24"/>
+          <w:szCs w:val="24"/>
+        </w:rPr>
+        <w:t xml:space="preserve">6.2 Wichtige docker-compose.yml Prinzipien</w:t>
       </w:r>
     </w:p>
     <w:p>
@@ -4416,7 +4756,7 @@
           <w:sz w:val="22"/>
           <w:szCs w:val="22"/>
         </w:rPr>
-        <w:t xml:space="preserve">nginx: systemd-Service, läuft als www-data</w:t>
+        <w:t xml:space="preserve">Nur nginx-Container ist nach aussen exponiert (Port 443/80)</w:t>
       </w:r>
     </w:p>
     <w:p>
@@ -4432,7 +4772,7 @@
           <w:sz w:val="22"/>
           <w:szCs w:val="22"/>
         </w:rPr>
-        <w:t xml:space="preserve">FastAPI: via uvicorn, als systemd-Service (oder gunicorn + uvicorn-Worker)</w:t>
+        <w:t xml:space="preserve">app und db kommunizieren über internes Docker-Netzwerk — kein öffentlicher Port</w:t>
       </w:r>
     </w:p>
     <w:p>
@@ -4448,7 +4788,7 @@
           <w:sz w:val="22"/>
           <w:szCs w:val="22"/>
         </w:rPr>
-        <w:t xml:space="preserve">PostgreSQL: systemd-Service, eigener postgres-User</w:t>
+        <w:t xml:space="preserve">PostgreSQL-Daten auf Named Volume (kein Bind-Mount): docker-managed, survives container restart</w:t>
       </w:r>
     </w:p>
     <w:p>
@@ -4464,7 +4804,23 @@
           <w:sz w:val="22"/>
           <w:szCs w:val="22"/>
         </w:rPr>
-        <w:t xml:space="preserve">Cron-Job: systemd-Timer oder crontab des App-Users</w:t>
+        <w:t xml:space="preserve">Secrets (DB-Passwort, JWT-Secret) via .env-Datei oder Docker Secrets — nie im Image</w:t>
+      </w:r>
+    </w:p>
+    <w:p>
+      <w:pPr>
+        <w:pStyle w:val="ListParagraph"/>
+        <w:numPr>
+          <w:ilvl w:val="0"/>
+          <w:numId w:val="2"/>
+        </w:numPr>
+      </w:pPr>
+      <w:r>
+        <w:rPr>
+          <w:sz w:val="22"/>
+          <w:szCs w:val="22"/>
+        </w:rPr>
+        <w:t xml:space="preserve">Health-Checks: db muss healthy sein bevor app startet (depends_on mit condition)</w:t>
       </w:r>
     </w:p>
     <w:p>
@@ -4488,7 +4844,7 @@
           <w:sz w:val="24"/>
           <w:szCs w:val="24"/>
         </w:rPr>
-        <w:t xml:space="preserve">6.2 Deployment-Ablauf (Erstinstallation)</w:t>
+        <w:t xml:space="preserve">6.3 Erstinstallation auf Infomaniak VPS</w:t>
       </w:r>
     </w:p>
     <w:p>
@@ -4504,7 +4860,7 @@
           <w:sz w:val="22"/>
           <w:szCs w:val="22"/>
         </w:rPr>
-        <w:t xml:space="preserve">VPS provisionieren (Ubuntu LTS)</w:t>
+        <w:t xml:space="preserve">VPS provisionieren (Ubuntu LTS), Docker + Docker Compose installieren</w:t>
       </w:r>
     </w:p>
     <w:p>
@@ -4520,7 +4876,7 @@
           <w:sz w:val="22"/>
           <w:szCs w:val="22"/>
         </w:rPr>
-        <w:t xml:space="preserve">PostgreSQL installieren, DB und App-User anlegen</w:t>
+        <w:t xml:space="preserve">DNS-Eintrag setzen, Certbot/acme.sh für Let's Encrypt</w:t>
       </w:r>
     </w:p>
     <w:p>
@@ -4536,7 +4892,7 @@
           <w:sz w:val="22"/>
           <w:szCs w:val="22"/>
         </w:rPr>
-        <w:t xml:space="preserve">Alembic-Migrationen ausführen (Schema erstellen)</w:t>
+        <w:t xml:space="preserve">Repository clonen, .env-Datei mit Secrets befüllen</w:t>
       </w:r>
     </w:p>
     <w:p>
@@ -4552,7 +4908,7 @@
           <w:sz w:val="22"/>
           <w:szCs w:val="22"/>
         </w:rPr>
-        <w:t xml:space="preserve">FastAPI-App deployen (Git clone + pip install)</w:t>
+        <w:t xml:space="preserve">docker compose up -d</w:t>
       </w:r>
     </w:p>
     <w:p>
@@ -4568,7 +4924,7 @@
           <w:sz w:val="22"/>
           <w:szCs w:val="22"/>
         </w:rPr>
-        <w:t xml:space="preserve">systemd-Services für uvicorn und nginx konfigurieren</w:t>
+        <w:t xml:space="preserve">Alembic-Migrationen im app-Container ausführen: docker compose exec app alembic upgrade head</w:t>
       </w:r>
     </w:p>
     <w:p>
@@ -4584,7 +4940,31 @@
           <w:sz w:val="22"/>
           <w:szCs w:val="22"/>
         </w:rPr>
-        <w:t xml:space="preserve">Certbot: Let's Encrypt Zertifikat ausstellen</w:t>
+        <w:t xml:space="preserve">Smoke-Test: Login + Anlass erstellen</w:t>
+      </w:r>
+    </w:p>
+    <w:p>
+      <w:pPr>
+        <w:spacing w:after="80"/>
+      </w:pPr>
+      <w:r>
+        <w:t xml:space="preserve"/>
+      </w:r>
+    </w:p>
+    <w:p>
+      <w:pPr>
+        <w:pStyle w:val="Heading2"/>
+        <w:spacing w:after="80" w:before="200"/>
+      </w:pPr>
+      <w:r>
+        <w:rPr>
+          <w:b/>
+          <w:bCs/>
+          <w:color w:val="3A6B8A"/>
+          <w:sz w:val="24"/>
+          <w:szCs w:val="24"/>
+        </w:rPr>
+        <w:t xml:space="preserve">6.4 Updates (laufender Betrieb)</w:t>
       </w:r>
     </w:p>
     <w:p>
@@ -4600,7 +4980,7 @@
           <w:sz w:val="22"/>
           <w:szCs w:val="22"/>
         </w:rPr>
-        <w:t xml:space="preserve">Backup-Cron konfigurieren</w:t>
+        <w:t xml:space="preserve">git pull auf VPS</w:t>
       </w:r>
     </w:p>
     <w:p>
@@ -4616,7 +4996,55 @@
           <w:sz w:val="22"/>
           <w:szCs w:val="22"/>
         </w:rPr>
-        <w:t xml:space="preserve">Smoke-Test: End-to-End Login + Anlass erstellen</w:t>
+        <w:t xml:space="preserve">docker compose build app</w:t>
+      </w:r>
+    </w:p>
+    <w:p>
+      <w:pPr>
+        <w:pStyle w:val="ListParagraph"/>
+        <w:numPr>
+          <w:ilvl w:val="0"/>
+          <w:numId w:val="2"/>
+        </w:numPr>
+      </w:pPr>
+      <w:r>
+        <w:rPr>
+          <w:sz w:val="22"/>
+          <w:szCs w:val="22"/>
+        </w:rPr>
+        <w:t xml:space="preserve">docker compose exec app alembic upgrade head (falls Schema-Änderungen)</w:t>
+      </w:r>
+    </w:p>
+    <w:p>
+      <w:pPr>
+        <w:pStyle w:val="ListParagraph"/>
+        <w:numPr>
+          <w:ilvl w:val="0"/>
+          <w:numId w:val="2"/>
+        </w:numPr>
+      </w:pPr>
+      <w:r>
+        <w:rPr>
+          <w:sz w:val="22"/>
+          <w:szCs w:val="22"/>
+        </w:rPr>
+        <w:t xml:space="preserve">docker compose up -d --no-deps app (nur app-Container neu starten, db und nginx laufen weiter)</w:t>
+      </w:r>
+    </w:p>
+    <w:p>
+      <w:pPr>
+        <w:spacing w:after="120" w:before="60"/>
+        <w:ind w:left="360"/>
+      </w:pPr>
+      <w:r>
+        <w:rPr>
+          <w:i/>
+          <w:iCs/>
+          <w:color w:val="8B4000"/>
+          <w:sz w:val="20"/>
+          <w:szCs w:val="20"/>
+        </w:rPr>
+        <w:t xml:space="preserve">⚠ Downtime bei Updates: wenige Sekunden (Container-Restart). Zero-Downtime-Deployment optional in Phase 2.</w:t>
       </w:r>
     </w:p>
     <w:p>
@@ -4640,7 +5068,518 @@
           <w:sz w:val="24"/>
           <w:szCs w:val="24"/>
         </w:rPr>
-        <w:t xml:space="preserve">6.3 Updates</w:t>
+        <w:t xml:space="preserve">6.5 Backup-Strategie (3-2-1)</w:t>
+      </w:r>
+    </w:p>
+    <w:p>
+      <w:pPr>
+        <w:spacing w:after="120"/>
+      </w:pPr>
+      <w:r>
+        <w:rPr>
+          <w:sz w:val="22"/>
+          <w:szCs w:val="22"/>
+        </w:rPr>
+        <w:t xml:space="preserve">Das System folgt der 3-2-1-Backup-Regel: 3 Kopien, 2 verschiedene Orte, 1 davon off-site vom VPS.</w:t>
+      </w:r>
+    </w:p>
+    <w:tbl>
+      <w:tblPr>
+        <w:tblW w:type="dxa" w:w="9026"/>
+        <w:tblBorders>
+          <w:top w:val="single" w:color="auto" w:sz="4"/>
+          <w:left w:val="single" w:color="auto" w:sz="4"/>
+          <w:bottom w:val="single" w:color="auto" w:sz="4"/>
+          <w:right w:val="single" w:color="auto" w:sz="4"/>
+          <w:insideH w:val="single" w:color="auto" w:sz="4"/>
+          <w:insideV w:val="single" w:color="auto" w:sz="4"/>
+        </w:tblBorders>
+      </w:tblPr>
+      <w:tblGrid>
+        <w:gridCol w:w="1200"/>
+        <w:gridCol w:w="2000"/>
+        <w:gridCol w:w="3200"/>
+        <w:gridCol w:w="2626"/>
+      </w:tblGrid>
+      <w:tr>
+        <w:tc>
+          <w:tcPr>
+            <w:tcW w:type="dxa" w:w="1200"/>
+            <w:tcBorders>
+              <w:top w:val="single" w:color="BBCCDD" w:sz="1"/>
+              <w:left w:val="single" w:color="BBCCDD" w:sz="1"/>
+              <w:bottom w:val="single" w:color="BBCCDD" w:sz="1"/>
+              <w:right w:val="single" w:color="BBCCDD" w:sz="1"/>
+            </w:tcBorders>
+            <w:shd w:fill="DDE8F0" w:val="clear"/>
+            <w:tcMar>
+              <w:top w:type="dxa" w:w="80"/>
+              <w:left w:type="dxa" w:w="120"/>
+              <w:bottom w:type="dxa" w:w="80"/>
+              <w:right w:type="dxa" w:w="120"/>
+            </w:tcMar>
+          </w:tcPr>
+          <w:p>
+            <w:r>
+              <w:rPr>
+                <w:b/>
+                <w:bCs/>
+                <w:sz w:val="20"/>
+                <w:szCs w:val="20"/>
+              </w:rPr>
+              <w:t xml:space="preserve">Stufe</w:t>
+            </w:r>
+          </w:p>
+        </w:tc>
+        <w:tc>
+          <w:tcPr>
+            <w:tcW w:type="dxa" w:w="2000"/>
+            <w:tcBorders>
+              <w:top w:val="single" w:color="BBCCDD" w:sz="1"/>
+              <w:left w:val="single" w:color="BBCCDD" w:sz="1"/>
+              <w:bottom w:val="single" w:color="BBCCDD" w:sz="1"/>
+              <w:right w:val="single" w:color="BBCCDD" w:sz="1"/>
+            </w:tcBorders>
+            <w:shd w:fill="DDE8F0" w:val="clear"/>
+            <w:tcMar>
+              <w:top w:type="dxa" w:w="80"/>
+              <w:left w:type="dxa" w:w="120"/>
+              <w:bottom w:type="dxa" w:w="80"/>
+              <w:right w:type="dxa" w:w="120"/>
+            </w:tcMar>
+          </w:tcPr>
+          <w:p>
+            <w:r>
+              <w:rPr>
+                <w:b/>
+                <w:bCs/>
+                <w:sz w:val="20"/>
+                <w:szCs w:val="20"/>
+              </w:rPr>
+              <w:t xml:space="preserve">Wo</w:t>
+            </w:r>
+          </w:p>
+        </w:tc>
+        <w:tc>
+          <w:tcPr>
+            <w:tcW w:type="dxa" w:w="3200"/>
+            <w:tcBorders>
+              <w:top w:val="single" w:color="BBCCDD" w:sz="1"/>
+              <w:left w:val="single" w:color="BBCCDD" w:sz="1"/>
+              <w:bottom w:val="single" w:color="BBCCDD" w:sz="1"/>
+              <w:right w:val="single" w:color="BBCCDD" w:sz="1"/>
+            </w:tcBorders>
+            <w:shd w:fill="DDE8F0" w:val="clear"/>
+            <w:tcMar>
+              <w:top w:type="dxa" w:w="80"/>
+              <w:left w:type="dxa" w:w="120"/>
+              <w:bottom w:type="dxa" w:w="80"/>
+              <w:right w:type="dxa" w:w="120"/>
+            </w:tcMar>
+          </w:tcPr>
+          <w:p>
+            <w:r>
+              <w:rPr>
+                <w:b/>
+                <w:bCs/>
+                <w:sz w:val="20"/>
+                <w:szCs w:val="20"/>
+              </w:rPr>
+              <w:t xml:space="preserve">Wie</w:t>
+            </w:r>
+          </w:p>
+        </w:tc>
+        <w:tc>
+          <w:tcPr>
+            <w:tcW w:type="dxa" w:w="2626"/>
+            <w:tcBorders>
+              <w:top w:val="single" w:color="BBCCDD" w:sz="1"/>
+              <w:left w:val="single" w:color="BBCCDD" w:sz="1"/>
+              <w:bottom w:val="single" w:color="BBCCDD" w:sz="1"/>
+              <w:right w:val="single" w:color="BBCCDD" w:sz="1"/>
+            </w:tcBorders>
+            <w:shd w:fill="DDE8F0" w:val="clear"/>
+            <w:tcMar>
+              <w:top w:type="dxa" w:w="80"/>
+              <w:left w:type="dxa" w:w="120"/>
+              <w:bottom w:type="dxa" w:w="80"/>
+              <w:right w:type="dxa" w:w="120"/>
+            </w:tcMar>
+          </w:tcPr>
+          <w:p>
+            <w:r>
+              <w:rPr>
+                <w:b/>
+                <w:bCs/>
+                <w:sz w:val="20"/>
+                <w:szCs w:val="20"/>
+              </w:rPr>
+              <w:t xml:space="preserve">Aufbewahrung</w:t>
+            </w:r>
+          </w:p>
+        </w:tc>
+      </w:tr>
+      <w:tr>
+        <w:tc>
+          <w:tcPr>
+            <w:tcW w:type="dxa" w:w="1200"/>
+            <w:tcBorders>
+              <w:top w:val="single" w:color="BBCCDD" w:sz="1"/>
+              <w:left w:val="single" w:color="BBCCDD" w:sz="1"/>
+              <w:bottom w:val="single" w:color="BBCCDD" w:sz="1"/>
+              <w:right w:val="single" w:color="BBCCDD" w:sz="1"/>
+            </w:tcBorders>
+            <w:shd w:fill="FFFFFF" w:val="clear"/>
+            <w:tcMar>
+              <w:top w:type="dxa" w:w="80"/>
+              <w:left w:type="dxa" w:w="120"/>
+              <w:bottom w:type="dxa" w:w="80"/>
+              <w:right w:type="dxa" w:w="120"/>
+            </w:tcMar>
+          </w:tcPr>
+          <w:p>
+            <w:r>
+              <w:rPr>
+                <w:b w:val="false"/>
+                <w:bCs w:val="false"/>
+                <w:sz w:val="20"/>
+                <w:szCs w:val="20"/>
+              </w:rPr>
+              <w:t xml:space="preserve">1 — Lokal</w:t>
+            </w:r>
+          </w:p>
+        </w:tc>
+        <w:tc>
+          <w:tcPr>
+            <w:tcW w:type="dxa" w:w="2000"/>
+            <w:tcBorders>
+              <w:top w:val="single" w:color="BBCCDD" w:sz="1"/>
+              <w:left w:val="single" w:color="BBCCDD" w:sz="1"/>
+              <w:bottom w:val="single" w:color="BBCCDD" w:sz="1"/>
+              <w:right w:val="single" w:color="BBCCDD" w:sz="1"/>
+            </w:tcBorders>
+            <w:shd w:fill="FFFFFF" w:val="clear"/>
+            <w:tcMar>
+              <w:top w:type="dxa" w:w="80"/>
+              <w:left w:type="dxa" w:w="120"/>
+              <w:bottom w:type="dxa" w:w="80"/>
+              <w:right w:type="dxa" w:w="120"/>
+            </w:tcMar>
+          </w:tcPr>
+          <w:p>
+            <w:r>
+              <w:rPr>
+                <w:b w:val="false"/>
+                <w:bCs w:val="false"/>
+                <w:sz w:val="20"/>
+                <w:szCs w:val="20"/>
+              </w:rPr>
+              <w:t xml:space="preserve">VPS (gleicher Server)</w:t>
+            </w:r>
+          </w:p>
+        </w:tc>
+        <w:tc>
+          <w:tcPr>
+            <w:tcW w:type="dxa" w:w="3200"/>
+            <w:tcBorders>
+              <w:top w:val="single" w:color="BBCCDD" w:sz="1"/>
+              <w:left w:val="single" w:color="BBCCDD" w:sz="1"/>
+              <w:bottom w:val="single" w:color="BBCCDD" w:sz="1"/>
+              <w:right w:val="single" w:color="BBCCDD" w:sz="1"/>
+            </w:tcBorders>
+            <w:shd w:fill="FFFFFF" w:val="clear"/>
+            <w:tcMar>
+              <w:top w:type="dxa" w:w="80"/>
+              <w:left w:type="dxa" w:w="120"/>
+              <w:bottom w:type="dxa" w:w="80"/>
+              <w:right w:type="dxa" w:w="120"/>
+            </w:tcMar>
+          </w:tcPr>
+          <w:p>
+            <w:r>
+              <w:rPr>
+                <w:b w:val="false"/>
+                <w:bCs w:val="false"/>
+                <w:sz w:val="20"/>
+                <w:szCs w:val="20"/>
+              </w:rPr>
+              <w:t xml:space="preserve">pg_dump → AES-256 (gpg) → lokales Verzeichnis</w:t>
+            </w:r>
+          </w:p>
+        </w:tc>
+        <w:tc>
+          <w:tcPr>
+            <w:tcW w:type="dxa" w:w="2626"/>
+            <w:tcBorders>
+              <w:top w:val="single" w:color="BBCCDD" w:sz="1"/>
+              <w:left w:val="single" w:color="BBCCDD" w:sz="1"/>
+              <w:bottom w:val="single" w:color="BBCCDD" w:sz="1"/>
+              <w:right w:val="single" w:color="BBCCDD" w:sz="1"/>
+            </w:tcBorders>
+            <w:shd w:fill="FFFFFF" w:val="clear"/>
+            <w:tcMar>
+              <w:top w:type="dxa" w:w="80"/>
+              <w:left w:type="dxa" w:w="120"/>
+              <w:bottom w:type="dxa" w:w="80"/>
+              <w:right w:type="dxa" w:w="120"/>
+            </w:tcMar>
+          </w:tcPr>
+          <w:p>
+            <w:r>
+              <w:rPr>
+                <w:b w:val="false"/>
+                <w:bCs w:val="false"/>
+                <w:sz w:val="20"/>
+                <w:szCs w:val="20"/>
+              </w:rPr>
+              <w:t xml:space="preserve">90 Tage Rotation</w:t>
+            </w:r>
+          </w:p>
+        </w:tc>
+      </w:tr>
+      <w:tr>
+        <w:tc>
+          <w:tcPr>
+            <w:tcW w:type="dxa" w:w="1200"/>
+            <w:tcBorders>
+              <w:top w:val="single" w:color="BBCCDD" w:sz="1"/>
+              <w:left w:val="single" w:color="BBCCDD" w:sz="1"/>
+              <w:bottom w:val="single" w:color="BBCCDD" w:sz="1"/>
+              <w:right w:val="single" w:color="BBCCDD" w:sz="1"/>
+            </w:tcBorders>
+            <w:shd w:fill="F5F8FB" w:val="clear"/>
+            <w:tcMar>
+              <w:top w:type="dxa" w:w="80"/>
+              <w:left w:type="dxa" w:w="120"/>
+              <w:bottom w:type="dxa" w:w="80"/>
+              <w:right w:type="dxa" w:w="120"/>
+            </w:tcMar>
+          </w:tcPr>
+          <w:p>
+            <w:r>
+              <w:rPr>
+                <w:b w:val="false"/>
+                <w:bCs w:val="false"/>
+                <w:sz w:val="20"/>
+                <w:szCs w:val="20"/>
+              </w:rPr>
+              <w:t xml:space="preserve">2 — Cloud</w:t>
+            </w:r>
+          </w:p>
+        </w:tc>
+        <w:tc>
+          <w:tcPr>
+            <w:tcW w:type="dxa" w:w="2000"/>
+            <w:tcBorders>
+              <w:top w:val="single" w:color="BBCCDD" w:sz="1"/>
+              <w:left w:val="single" w:color="BBCCDD" w:sz="1"/>
+              <w:bottom w:val="single" w:color="BBCCDD" w:sz="1"/>
+              <w:right w:val="single" w:color="BBCCDD" w:sz="1"/>
+            </w:tcBorders>
+            <w:shd w:fill="F5F8FB" w:val="clear"/>
+            <w:tcMar>
+              <w:top w:type="dxa" w:w="80"/>
+              <w:left w:type="dxa" w:w="120"/>
+              <w:bottom w:type="dxa" w:w="80"/>
+              <w:right w:type="dxa" w:w="120"/>
+            </w:tcMar>
+          </w:tcPr>
+          <w:p>
+            <w:r>
+              <w:rPr>
+                <w:b w:val="false"/>
+                <w:bCs w:val="false"/>
+                <w:sz w:val="20"/>
+                <w:szCs w:val="20"/>
+              </w:rPr>
+              <w:t xml:space="preserve">Infomaniak kDrive (CH)</w:t>
+            </w:r>
+          </w:p>
+        </w:tc>
+        <w:tc>
+          <w:tcPr>
+            <w:tcW w:type="dxa" w:w="3200"/>
+            <w:tcBorders>
+              <w:top w:val="single" w:color="BBCCDD" w:sz="1"/>
+              <w:left w:val="single" w:color="BBCCDD" w:sz="1"/>
+              <w:bottom w:val="single" w:color="BBCCDD" w:sz="1"/>
+              <w:right w:val="single" w:color="BBCCDD" w:sz="1"/>
+            </w:tcBorders>
+            <w:shd w:fill="F5F8FB" w:val="clear"/>
+            <w:tcMar>
+              <w:top w:type="dxa" w:w="80"/>
+              <w:left w:type="dxa" w:w="120"/>
+              <w:bottom w:type="dxa" w:w="80"/>
+              <w:right w:type="dxa" w:w="120"/>
+            </w:tcMar>
+          </w:tcPr>
+          <w:p>
+            <w:r>
+              <w:rPr>
+                <w:b w:val="false"/>
+                <w:bCs w:val="false"/>
+                <w:sz w:val="20"/>
+                <w:szCs w:val="20"/>
+              </w:rPr>
+              <w:t xml:space="preserve">Rclone copy nach lokalem Backup (gleicher Cron-Job)</w:t>
+            </w:r>
+          </w:p>
+        </w:tc>
+        <w:tc>
+          <w:tcPr>
+            <w:tcW w:type="dxa" w:w="2626"/>
+            <w:tcBorders>
+              <w:top w:val="single" w:color="BBCCDD" w:sz="1"/>
+              <w:left w:val="single" w:color="BBCCDD" w:sz="1"/>
+              <w:bottom w:val="single" w:color="BBCCDD" w:sz="1"/>
+              <w:right w:val="single" w:color="BBCCDD" w:sz="1"/>
+            </w:tcBorders>
+            <w:shd w:fill="F5F8FB" w:val="clear"/>
+            <w:tcMar>
+              <w:top w:type="dxa" w:w="80"/>
+              <w:left w:type="dxa" w:w="120"/>
+              <w:bottom w:type="dxa" w:w="80"/>
+              <w:right w:type="dxa" w:w="120"/>
+            </w:tcMar>
+          </w:tcPr>
+          <w:p>
+            <w:r>
+              <w:rPr>
+                <w:b w:val="false"/>
+                <w:bCs w:val="false"/>
+                <w:sz w:val="20"/>
+                <w:szCs w:val="20"/>
+              </w:rPr>
+              <w:t xml:space="preserve">Manuell verwaltet</w:t>
+            </w:r>
+          </w:p>
+        </w:tc>
+      </w:tr>
+      <w:tr>
+        <w:tc>
+          <w:tcPr>
+            <w:tcW w:type="dxa" w:w="1200"/>
+            <w:tcBorders>
+              <w:top w:val="single" w:color="BBCCDD" w:sz="1"/>
+              <w:left w:val="single" w:color="BBCCDD" w:sz="1"/>
+              <w:bottom w:val="single" w:color="BBCCDD" w:sz="1"/>
+              <w:right w:val="single" w:color="BBCCDD" w:sz="1"/>
+            </w:tcBorders>
+            <w:shd w:fill="FFFFFF" w:val="clear"/>
+            <w:tcMar>
+              <w:top w:type="dxa" w:w="80"/>
+              <w:left w:type="dxa" w:w="120"/>
+              <w:bottom w:type="dxa" w:w="80"/>
+              <w:right w:type="dxa" w:w="120"/>
+            </w:tcMar>
+          </w:tcPr>
+          <w:p>
+            <w:r>
+              <w:rPr>
+                <w:b w:val="false"/>
+                <w:bCs w:val="false"/>
+                <w:sz w:val="20"/>
+                <w:szCs w:val="20"/>
+              </w:rPr>
+              <w:t xml:space="preserve">3 — Lokal PC</w:t>
+            </w:r>
+          </w:p>
+        </w:tc>
+        <w:tc>
+          <w:tcPr>
+            <w:tcW w:type="dxa" w:w="2000"/>
+            <w:tcBorders>
+              <w:top w:val="single" w:color="BBCCDD" w:sz="1"/>
+              <w:left w:val="single" w:color="BBCCDD" w:sz="1"/>
+              <w:bottom w:val="single" w:color="BBCCDD" w:sz="1"/>
+              <w:right w:val="single" w:color="BBCCDD" w:sz="1"/>
+            </w:tcBorders>
+            <w:shd w:fill="FFFFFF" w:val="clear"/>
+            <w:tcMar>
+              <w:top w:type="dxa" w:w="80"/>
+              <w:left w:type="dxa" w:w="120"/>
+              <w:bottom w:type="dxa" w:w="80"/>
+              <w:right w:type="dxa" w:w="120"/>
+            </w:tcMar>
+          </w:tcPr>
+          <w:p>
+            <w:r>
+              <w:rPr>
+                <w:b w:val="false"/>
+                <w:bCs w:val="false"/>
+                <w:sz w:val="20"/>
+                <w:szCs w:val="20"/>
+              </w:rPr>
+              <w:t xml:space="preserve">Rechner des Admins</w:t>
+            </w:r>
+          </w:p>
+        </w:tc>
+        <w:tc>
+          <w:tcPr>
+            <w:tcW w:type="dxa" w:w="3200"/>
+            <w:tcBorders>
+              <w:top w:val="single" w:color="BBCCDD" w:sz="1"/>
+              <w:left w:val="single" w:color="BBCCDD" w:sz="1"/>
+              <w:bottom w:val="single" w:color="BBCCDD" w:sz="1"/>
+              <w:right w:val="single" w:color="BBCCDD" w:sz="1"/>
+            </w:tcBorders>
+            <w:shd w:fill="FFFFFF" w:val="clear"/>
+            <w:tcMar>
+              <w:top w:type="dxa" w:w="80"/>
+              <w:left w:type="dxa" w:w="120"/>
+              <w:bottom w:type="dxa" w:w="80"/>
+              <w:right w:type="dxa" w:w="120"/>
+            </w:tcMar>
+          </w:tcPr>
+          <w:p>
+            <w:r>
+              <w:rPr>
+                <w:b w:val="false"/>
+                <w:bCs w:val="false"/>
+                <w:sz w:val="20"/>
+                <w:szCs w:val="20"/>
+              </w:rPr>
+              <w:t xml:space="preserve">Infomaniak kDrive Desktop-Client (automatische Synchronisation)</w:t>
+            </w:r>
+          </w:p>
+        </w:tc>
+        <w:tc>
+          <w:tcPr>
+            <w:tcW w:type="dxa" w:w="2626"/>
+            <w:tcBorders>
+              <w:top w:val="single" w:color="BBCCDD" w:sz="1"/>
+              <w:left w:val="single" w:color="BBCCDD" w:sz="1"/>
+              <w:bottom w:val="single" w:color="BBCCDD" w:sz="1"/>
+              <w:right w:val="single" w:color="BBCCDD" w:sz="1"/>
+            </w:tcBorders>
+            <w:shd w:fill="FFFFFF" w:val="clear"/>
+            <w:tcMar>
+              <w:top w:type="dxa" w:w="80"/>
+              <w:left w:type="dxa" w:w="120"/>
+              <w:bottom w:type="dxa" w:w="80"/>
+              <w:right w:type="dxa" w:w="120"/>
+            </w:tcMar>
+          </w:tcPr>
+          <w:p>
+            <w:r>
+              <w:rPr>
+                <w:b w:val="false"/>
+                <w:bCs w:val="false"/>
+                <w:sz w:val="20"/>
+                <w:szCs w:val="20"/>
+              </w:rPr>
+              <w:t xml:space="preserve">Automatisch aktuell</w:t>
+            </w:r>
+          </w:p>
+        </w:tc>
+      </w:tr>
+    </w:tbl>
+    <w:p>
+      <w:pPr>
+        <w:spacing w:after="80"/>
+      </w:pPr>
+      <w:r>
+        <w:t xml:space="preserve"/>
       </w:r>
     </w:p>
     <w:p>
@@ -4656,7 +5595,7 @@
           <w:sz w:val="22"/>
           <w:szCs w:val="22"/>
         </w:rPr>
-        <w:t xml:space="preserve">Git pull + pip install --upgrade auf VPS</w:t>
+        <w:t xml:space="preserve">Backup-Verschlüsselung: AES-256 via gpg, bevor Upload zu kDrive — Infomaniak sieht nur verschlüsselte Daten</w:t>
       </w:r>
     </w:p>
     <w:p>
@@ -4672,7 +5611,7 @@
           <w:sz w:val="22"/>
           <w:szCs w:val="22"/>
         </w:rPr>
-        <w:t xml:space="preserve">Alembic migrate für Schemaänderungen</w:t>
+        <w:t xml:space="preserve">kDrive Desktop-Client verfügbar für Windows, Mac und Linux</w:t>
       </w:r>
     </w:p>
     <w:p>
@@ -4688,7 +5627,7 @@
           <w:sz w:val="22"/>
           <w:szCs w:val="22"/>
         </w:rPr>
-        <w:t xml:space="preserve">systemctl restart uvicorn</w:t>
+        <w:t xml:space="preserve">Kein manueller SSH-Zugriff für Backup-Kontrolle nötig — kDrive-Sync zeigt lokalen Stand</w:t>
       </w:r>
     </w:p>
     <w:p>
@@ -4704,7 +5643,95 @@
           <w:sz w:val="22"/>
           <w:szCs w:val="22"/>
         </w:rPr>
-        <w:t xml:space="preserve">Kein Downtime bei Konfigurationsänderungen (nginx reload)</w:t>
+        <w:t xml:space="preserve">Wiederherstellung: gpg-entschlüsseln → pg_restore in Docker-Container</w:t>
+      </w:r>
+    </w:p>
+    <w:p>
+      <w:pPr>
+        <w:spacing w:after="80"/>
+      </w:pPr>
+      <w:r>
+        <w:t xml:space="preserve"/>
+      </w:r>
+    </w:p>
+    <w:p>
+      <w:pPr>
+        <w:pStyle w:val="Heading2"/>
+        <w:spacing w:after="80" w:before="200"/>
+      </w:pPr>
+      <w:r>
+        <w:rPr>
+          <w:b/>
+          <w:bCs/>
+          <w:color w:val="3A6B8A"/>
+          <w:sz w:val="24"/>
+          <w:szCs w:val="24"/>
+        </w:rPr>
+        <w:t xml:space="preserve">6.6 Umzug auf anderen Anbieter</w:t>
+      </w:r>
+    </w:p>
+    <w:p>
+      <w:pPr>
+        <w:pStyle w:val="ListParagraph"/>
+        <w:numPr>
+          <w:ilvl w:val="0"/>
+          <w:numId w:val="2"/>
+        </w:numPr>
+      </w:pPr>
+      <w:r>
+        <w:rPr>
+          <w:sz w:val="22"/>
+          <w:szCs w:val="22"/>
+        </w:rPr>
+        <w:t xml:space="preserve">docker compose down</w:t>
+      </w:r>
+    </w:p>
+    <w:p>
+      <w:pPr>
+        <w:pStyle w:val="ListParagraph"/>
+        <w:numPr>
+          <w:ilvl w:val="0"/>
+          <w:numId w:val="2"/>
+        </w:numPr>
+      </w:pPr>
+      <w:r>
+        <w:rPr>
+          <w:sz w:val="22"/>
+          <w:szCs w:val="22"/>
+        </w:rPr>
+        <w:t xml:space="preserve">PostgreSQL-Volume exportieren: docker run --rm -v db_data:/data ... tar czf backup.tar.gz /data</w:t>
+      </w:r>
+    </w:p>
+    <w:p>
+      <w:pPr>
+        <w:pStyle w:val="ListParagraph"/>
+        <w:numPr>
+          <w:ilvl w:val="0"/>
+          <w:numId w:val="2"/>
+        </w:numPr>
+      </w:pPr>
+      <w:r>
+        <w:rPr>
+          <w:sz w:val="22"/>
+          <w:szCs w:val="22"/>
+        </w:rPr>
+        <w:t xml:space="preserve">Volume auf neuem VPS einspielen, Repository clonen, .env befüllen</w:t>
+      </w:r>
+    </w:p>
+    <w:p>
+      <w:pPr>
+        <w:pStyle w:val="ListParagraph"/>
+        <w:numPr>
+          <w:ilvl w:val="0"/>
+          <w:numId w:val="2"/>
+        </w:numPr>
+      </w:pPr>
+      <w:r>
+        <w:rPr>
+          <w:sz w:val="22"/>
+          <w:szCs w:val="22"/>
+        </w:rPr>
+        <w:t xml:space="preserve">docker compose up -d — fertig</w:t>
       </w:r>
     </w:p>
     <w:p>
@@ -4720,7 +5747,7 @@
           <w:sz w:val="20"/>
           <w:szCs w:val="20"/>
         </w:rPr>
-        <w:t xml:space="preserve">⚠ Für Zero-Downtime-Deployments (Phase 2): Blue-Green oder Rolling Update via systemd.</w:t>
+        <w:t xml:space="preserve">⚠ Geschätzter Aufwand für einen Umzug: 1-2 Stunden. Das ist der Hauptvorteil von Docker gegenüber Bare-Metal.</w:t>
       </w:r>
     </w:p>
     <w:p>
@@ -4747,7 +5774,471 @@
           <w:sz w:val="28"/>
           <w:szCs w:val="28"/>
         </w:rPr>
-        <w:t xml:space="preserve">7. Offene Entscheide</w:t>
+        <w:t xml:space="preserve">7. Getroffene Entscheide</w:t>
+      </w:r>
+    </w:p>
+    <w:tbl>
+      <w:tblPr>
+        <w:tblW w:type="dxa" w:w="9026"/>
+        <w:tblBorders>
+          <w:top w:val="single" w:color="auto" w:sz="4"/>
+          <w:left w:val="single" w:color="auto" w:sz="4"/>
+          <w:bottom w:val="single" w:color="auto" w:sz="4"/>
+          <w:right w:val="single" w:color="auto" w:sz="4"/>
+          <w:insideH w:val="single" w:color="auto" w:sz="4"/>
+          <w:insideV w:val="single" w:color="auto" w:sz="4"/>
+        </w:tblBorders>
+      </w:tblPr>
+      <w:tblGrid>
+        <w:gridCol w:w="3200"/>
+        <w:gridCol w:w="5826"/>
+      </w:tblGrid>
+      <w:tr>
+        <w:tc>
+          <w:tcPr>
+            <w:tcW w:type="dxa" w:w="3200"/>
+            <w:tcBorders>
+              <w:top w:val="single" w:color="BBCCDD" w:sz="1"/>
+              <w:left w:val="single" w:color="BBCCDD" w:sz="1"/>
+              <w:bottom w:val="single" w:color="BBCCDD" w:sz="1"/>
+              <w:right w:val="single" w:color="BBCCDD" w:sz="1"/>
+            </w:tcBorders>
+            <w:shd w:fill="DDE8F0" w:val="clear"/>
+            <w:tcMar>
+              <w:top w:type="dxa" w:w="80"/>
+              <w:left w:type="dxa" w:w="120"/>
+              <w:bottom w:type="dxa" w:w="80"/>
+              <w:right w:type="dxa" w:w="120"/>
+            </w:tcMar>
+          </w:tcPr>
+          <w:p>
+            <w:r>
+              <w:rPr>
+                <w:b/>
+                <w:bCs/>
+                <w:sz w:val="20"/>
+                <w:szCs w:val="20"/>
+              </w:rPr>
+              <w:t xml:space="preserve">Entscheid</w:t>
+            </w:r>
+          </w:p>
+        </w:tc>
+        <w:tc>
+          <w:tcPr>
+            <w:tcW w:type="dxa" w:w="5826"/>
+            <w:tcBorders>
+              <w:top w:val="single" w:color="BBCCDD" w:sz="1"/>
+              <w:left w:val="single" w:color="BBCCDD" w:sz="1"/>
+              <w:bottom w:val="single" w:color="BBCCDD" w:sz="1"/>
+              <w:right w:val="single" w:color="BBCCDD" w:sz="1"/>
+            </w:tcBorders>
+            <w:shd w:fill="DDE8F0" w:val="clear"/>
+            <w:tcMar>
+              <w:top w:type="dxa" w:w="80"/>
+              <w:left w:type="dxa" w:w="120"/>
+              <w:bottom w:type="dxa" w:w="80"/>
+              <w:right w:type="dxa" w:w="120"/>
+            </w:tcMar>
+          </w:tcPr>
+          <w:p>
+            <w:r>
+              <w:rPr>
+                <w:b/>
+                <w:bCs/>
+                <w:sz w:val="20"/>
+                <w:szCs w:val="20"/>
+              </w:rPr>
+              <w:t xml:space="preserve">Beschluss</w:t>
+            </w:r>
+          </w:p>
+        </w:tc>
+      </w:tr>
+      <w:tr>
+        <w:tc>
+          <w:tcPr>
+            <w:tcW w:type="dxa" w:w="3200"/>
+            <w:tcBorders>
+              <w:top w:val="single" w:color="BBCCDD" w:sz="1"/>
+              <w:left w:val="single" w:color="BBCCDD" w:sz="1"/>
+              <w:bottom w:val="single" w:color="BBCCDD" w:sz="1"/>
+              <w:right w:val="single" w:color="BBCCDD" w:sz="1"/>
+            </w:tcBorders>
+            <w:shd w:fill="FFFFFF" w:val="clear"/>
+            <w:tcMar>
+              <w:top w:type="dxa" w:w="80"/>
+              <w:left w:type="dxa" w:w="120"/>
+              <w:bottom w:type="dxa" w:w="80"/>
+              <w:right w:type="dxa" w:w="120"/>
+            </w:tcMar>
+          </w:tcPr>
+          <w:p>
+            <w:r>
+              <w:rPr>
+                <w:b w:val="false"/>
+                <w:bCs w:val="false"/>
+                <w:sz w:val="20"/>
+                <w:szCs w:val="20"/>
+              </w:rPr>
+              <w:t xml:space="preserve">VPS-Anbieter</w:t>
+            </w:r>
+          </w:p>
+        </w:tc>
+        <w:tc>
+          <w:tcPr>
+            <w:tcW w:type="dxa" w:w="5826"/>
+            <w:tcBorders>
+              <w:top w:val="single" w:color="BBCCDD" w:sz="1"/>
+              <w:left w:val="single" w:color="BBCCDD" w:sz="1"/>
+              <w:bottom w:val="single" w:color="BBCCDD" w:sz="1"/>
+              <w:right w:val="single" w:color="BBCCDD" w:sz="1"/>
+            </w:tcBorders>
+            <w:shd w:fill="FFFFFF" w:val="clear"/>
+            <w:tcMar>
+              <w:top w:type="dxa" w:w="80"/>
+              <w:left w:type="dxa" w:w="120"/>
+              <w:bottom w:type="dxa" w:w="80"/>
+              <w:right w:type="dxa" w:w="120"/>
+            </w:tcMar>
+          </w:tcPr>
+          <w:p>
+            <w:r>
+              <w:rPr>
+                <w:b w:val="false"/>
+                <w:bCs w:val="false"/>
+                <w:sz w:val="20"/>
+                <w:szCs w:val="20"/>
+              </w:rPr>
+              <w:t xml:space="preserve">Infomaniak (CH) — Rechenzentren Genf/Zürich, ISO 27001, DSG-konform, CHF-Abrechnung</w:t>
+            </w:r>
+          </w:p>
+        </w:tc>
+      </w:tr>
+      <w:tr>
+        <w:tc>
+          <w:tcPr>
+            <w:tcW w:type="dxa" w:w="3200"/>
+            <w:tcBorders>
+              <w:top w:val="single" w:color="BBCCDD" w:sz="1"/>
+              <w:left w:val="single" w:color="BBCCDD" w:sz="1"/>
+              <w:bottom w:val="single" w:color="BBCCDD" w:sz="1"/>
+              <w:right w:val="single" w:color="BBCCDD" w:sz="1"/>
+            </w:tcBorders>
+            <w:shd w:fill="F5F8FB" w:val="clear"/>
+            <w:tcMar>
+              <w:top w:type="dxa" w:w="80"/>
+              <w:left w:type="dxa" w:w="120"/>
+              <w:bottom w:type="dxa" w:w="80"/>
+              <w:right w:type="dxa" w:w="120"/>
+            </w:tcMar>
+          </w:tcPr>
+          <w:p>
+            <w:r>
+              <w:rPr>
+                <w:b w:val="false"/>
+                <w:bCs w:val="false"/>
+                <w:sz w:val="20"/>
+                <w:szCs w:val="20"/>
+              </w:rPr>
+              <w:t xml:space="preserve">Deployment-Methode</w:t>
+            </w:r>
+          </w:p>
+        </w:tc>
+        <w:tc>
+          <w:tcPr>
+            <w:tcW w:type="dxa" w:w="5826"/>
+            <w:tcBorders>
+              <w:top w:val="single" w:color="BBCCDD" w:sz="1"/>
+              <w:left w:val="single" w:color="BBCCDD" w:sz="1"/>
+              <w:bottom w:val="single" w:color="BBCCDD" w:sz="1"/>
+              <w:right w:val="single" w:color="BBCCDD" w:sz="1"/>
+            </w:tcBorders>
+            <w:shd w:fill="F5F8FB" w:val="clear"/>
+            <w:tcMar>
+              <w:top w:type="dxa" w:w="80"/>
+              <w:left w:type="dxa" w:w="120"/>
+              <w:bottom w:type="dxa" w:w="80"/>
+              <w:right w:type="dxa" w:w="120"/>
+            </w:tcMar>
+          </w:tcPr>
+          <w:p>
+            <w:r>
+              <w:rPr>
+                <w:b w:val="false"/>
+                <w:bCs w:val="false"/>
+                <w:sz w:val="20"/>
+                <w:szCs w:val="20"/>
+              </w:rPr>
+              <w:t xml:space="preserve">Docker Compose (3 Container: nginx, FastAPI/uvicorn, PostgreSQL)</w:t>
+            </w:r>
+          </w:p>
+        </w:tc>
+      </w:tr>
+      <w:tr>
+        <w:tc>
+          <w:tcPr>
+            <w:tcW w:type="dxa" w:w="3200"/>
+            <w:tcBorders>
+              <w:top w:val="single" w:color="BBCCDD" w:sz="1"/>
+              <w:left w:val="single" w:color="BBCCDD" w:sz="1"/>
+              <w:bottom w:val="single" w:color="BBCCDD" w:sz="1"/>
+              <w:right w:val="single" w:color="BBCCDD" w:sz="1"/>
+            </w:tcBorders>
+            <w:shd w:fill="FFFFFF" w:val="clear"/>
+            <w:tcMar>
+              <w:top w:type="dxa" w:w="80"/>
+              <w:left w:type="dxa" w:w="120"/>
+              <w:bottom w:type="dxa" w:w="80"/>
+              <w:right w:type="dxa" w:w="120"/>
+            </w:tcMar>
+          </w:tcPr>
+          <w:p>
+            <w:r>
+              <w:rPr>
+                <w:b w:val="false"/>
+                <w:bCs w:val="false"/>
+                <w:sz w:val="20"/>
+                <w:szCs w:val="20"/>
+              </w:rPr>
+              <w:t xml:space="preserve">Rendering</w:t>
+            </w:r>
+          </w:p>
+        </w:tc>
+        <w:tc>
+          <w:tcPr>
+            <w:tcW w:type="dxa" w:w="5826"/>
+            <w:tcBorders>
+              <w:top w:val="single" w:color="BBCCDD" w:sz="1"/>
+              <w:left w:val="single" w:color="BBCCDD" w:sz="1"/>
+              <w:bottom w:val="single" w:color="BBCCDD" w:sz="1"/>
+              <w:right w:val="single" w:color="BBCCDD" w:sz="1"/>
+            </w:tcBorders>
+            <w:shd w:fill="FFFFFF" w:val="clear"/>
+            <w:tcMar>
+              <w:top w:type="dxa" w:w="80"/>
+              <w:left w:type="dxa" w:w="120"/>
+              <w:bottom w:type="dxa" w:w="80"/>
+              <w:right w:type="dxa" w:w="120"/>
+            </w:tcMar>
+          </w:tcPr>
+          <w:p>
+            <w:r>
+              <w:rPr>
+                <w:b w:val="false"/>
+                <w:bCs w:val="false"/>
+                <w:sz w:val="20"/>
+                <w:szCs w:val="20"/>
+              </w:rPr>
+              <w:t xml:space="preserve">Server-side Rendering (Jinja2) + HTMX für Interaktivität</w:t>
+            </w:r>
+          </w:p>
+        </w:tc>
+      </w:tr>
+      <w:tr>
+        <w:tc>
+          <w:tcPr>
+            <w:tcW w:type="dxa" w:w="3200"/>
+            <w:tcBorders>
+              <w:top w:val="single" w:color="BBCCDD" w:sz="1"/>
+              <w:left w:val="single" w:color="BBCCDD" w:sz="1"/>
+              <w:bottom w:val="single" w:color="BBCCDD" w:sz="1"/>
+              <w:right w:val="single" w:color="BBCCDD" w:sz="1"/>
+            </w:tcBorders>
+            <w:shd w:fill="F5F8FB" w:val="clear"/>
+            <w:tcMar>
+              <w:top w:type="dxa" w:w="80"/>
+              <w:left w:type="dxa" w:w="120"/>
+              <w:bottom w:type="dxa" w:w="80"/>
+              <w:right w:type="dxa" w:w="120"/>
+            </w:tcMar>
+          </w:tcPr>
+          <w:p>
+            <w:r>
+              <w:rPr>
+                <w:b w:val="false"/>
+                <w:bCs w:val="false"/>
+                <w:sz w:val="20"/>
+                <w:szCs w:val="20"/>
+              </w:rPr>
+              <w:t xml:space="preserve">Authentifizierung</w:t>
+            </w:r>
+          </w:p>
+        </w:tc>
+        <w:tc>
+          <w:tcPr>
+            <w:tcW w:type="dxa" w:w="5826"/>
+            <w:tcBorders>
+              <w:top w:val="single" w:color="BBCCDD" w:sz="1"/>
+              <w:left w:val="single" w:color="BBCCDD" w:sz="1"/>
+              <w:bottom w:val="single" w:color="BBCCDD" w:sz="1"/>
+              <w:right w:val="single" w:color="BBCCDD" w:sz="1"/>
+            </w:tcBorders>
+            <w:shd w:fill="F5F8FB" w:val="clear"/>
+            <w:tcMar>
+              <w:top w:type="dxa" w:w="80"/>
+              <w:left w:type="dxa" w:w="120"/>
+              <w:bottom w:type="dxa" w:w="80"/>
+              <w:right w:type="dxa" w:w="120"/>
+            </w:tcMar>
+          </w:tcPr>
+          <w:p>
+            <w:r>
+              <w:rPr>
+                <w:b w:val="false"/>
+                <w:bCs w:val="false"/>
+                <w:sz w:val="20"/>
+                <w:szCs w:val="20"/>
+              </w:rPr>
+              <w:t xml:space="preserve">Username + Passwort lokal, JWT im HttpOnly-Cookie</w:t>
+            </w:r>
+          </w:p>
+        </w:tc>
+      </w:tr>
+      <w:tr>
+        <w:tc>
+          <w:tcPr>
+            <w:tcW w:type="dxa" w:w="3200"/>
+            <w:tcBorders>
+              <w:top w:val="single" w:color="BBCCDD" w:sz="1"/>
+              <w:left w:val="single" w:color="BBCCDD" w:sz="1"/>
+              <w:bottom w:val="single" w:color="BBCCDD" w:sz="1"/>
+              <w:right w:val="single" w:color="BBCCDD" w:sz="1"/>
+            </w:tcBorders>
+            <w:shd w:fill="FFFFFF" w:val="clear"/>
+            <w:tcMar>
+              <w:top w:type="dxa" w:w="80"/>
+              <w:left w:type="dxa" w:w="120"/>
+              <w:bottom w:type="dxa" w:w="80"/>
+              <w:right w:type="dxa" w:w="120"/>
+            </w:tcMar>
+          </w:tcPr>
+          <w:p>
+            <w:r>
+              <w:rPr>
+                <w:b w:val="false"/>
+                <w:bCs w:val="false"/>
+                <w:sz w:val="20"/>
+                <w:szCs w:val="20"/>
+              </w:rPr>
+              <w:t xml:space="preserve">Migrationen</w:t>
+            </w:r>
+          </w:p>
+        </w:tc>
+        <w:tc>
+          <w:tcPr>
+            <w:tcW w:type="dxa" w:w="5826"/>
+            <w:tcBorders>
+              <w:top w:val="single" w:color="BBCCDD" w:sz="1"/>
+              <w:left w:val="single" w:color="BBCCDD" w:sz="1"/>
+              <w:bottom w:val="single" w:color="BBCCDD" w:sz="1"/>
+              <w:right w:val="single" w:color="BBCCDD" w:sz="1"/>
+            </w:tcBorders>
+            <w:shd w:fill="FFFFFF" w:val="clear"/>
+            <w:tcMar>
+              <w:top w:type="dxa" w:w="80"/>
+              <w:left w:type="dxa" w:w="120"/>
+              <w:bottom w:type="dxa" w:w="80"/>
+              <w:right w:type="dxa" w:w="120"/>
+            </w:tcMar>
+          </w:tcPr>
+          <w:p>
+            <w:r>
+              <w:rPr>
+                <w:b w:val="false"/>
+                <w:bCs w:val="false"/>
+                <w:sz w:val="20"/>
+                <w:szCs w:val="20"/>
+              </w:rPr>
+              <w:t xml:space="preserve">Alembic (Python, versioniert, rollback-fähig)</w:t>
+            </w:r>
+          </w:p>
+        </w:tc>
+      </w:tr>
+      <w:tr>
+        <w:tc>
+          <w:tcPr>
+            <w:tcW w:type="dxa" w:w="3200"/>
+            <w:tcBorders>
+              <w:top w:val="single" w:color="BBCCDD" w:sz="1"/>
+              <w:left w:val="single" w:color="BBCCDD" w:sz="1"/>
+              <w:bottom w:val="single" w:color="BBCCDD" w:sz="1"/>
+              <w:right w:val="single" w:color="BBCCDD" w:sz="1"/>
+            </w:tcBorders>
+            <w:shd w:fill="F5F8FB" w:val="clear"/>
+            <w:tcMar>
+              <w:top w:type="dxa" w:w="80"/>
+              <w:left w:type="dxa" w:w="120"/>
+              <w:bottom w:type="dxa" w:w="80"/>
+              <w:right w:type="dxa" w:w="120"/>
+            </w:tcMar>
+          </w:tcPr>
+          <w:p>
+            <w:r>
+              <w:rPr>
+                <w:b w:val="false"/>
+                <w:bCs w:val="false"/>
+                <w:sz w:val="20"/>
+                <w:szCs w:val="20"/>
+              </w:rPr>
+              <w:t xml:space="preserve">Backup-Strategie</w:t>
+            </w:r>
+          </w:p>
+        </w:tc>
+        <w:tc>
+          <w:tcPr>
+            <w:tcW w:type="dxa" w:w="5826"/>
+            <w:tcBorders>
+              <w:top w:val="single" w:color="BBCCDD" w:sz="1"/>
+              <w:left w:val="single" w:color="BBCCDD" w:sz="1"/>
+              <w:bottom w:val="single" w:color="BBCCDD" w:sz="1"/>
+              <w:right w:val="single" w:color="BBCCDD" w:sz="1"/>
+            </w:tcBorders>
+            <w:shd w:fill="F5F8FB" w:val="clear"/>
+            <w:tcMar>
+              <w:top w:type="dxa" w:w="80"/>
+              <w:left w:type="dxa" w:w="120"/>
+              <w:bottom w:type="dxa" w:w="80"/>
+              <w:right w:type="dxa" w:w="120"/>
+            </w:tcMar>
+          </w:tcPr>
+          <w:p>
+            <w:r>
+              <w:rPr>
+                <w:b w:val="false"/>
+                <w:bCs w:val="false"/>
+                <w:sz w:val="20"/>
+                <w:szCs w:val="20"/>
+              </w:rPr>
+              <w:t xml:space="preserve">3-2-1: lokal auf VPS (90 Tage) → Infomaniak kDrive (Rclone, auto.) → lokaler Rechner (kDrive-Sync-Client)</w:t>
+            </w:r>
+          </w:p>
+        </w:tc>
+      </w:tr>
+    </w:tbl>
+    <w:p>
+      <w:pPr>
+        <w:spacing w:after="80"/>
+      </w:pPr>
+      <w:r>
+        <w:t xml:space="preserve"/>
+      </w:r>
+    </w:p>
+    <w:p>
+      <w:pPr>
+        <w:pStyle w:val="Heading1"/>
+        <w:pBdr>
+          <w:bottom w:val="single" w:color="AABBD0" w:sz="4" w:space="1"/>
+        </w:pBdr>
+        <w:spacing w:after="120" w:before="320"/>
+      </w:pPr>
+      <w:r>
+        <w:rPr>
+          <w:b/>
+          <w:bCs/>
+          <w:color w:val="2E4057"/>
+          <w:sz w:val="28"/>
+          <w:szCs w:val="28"/>
+        </w:rPr>
+        <w:t xml:space="preserve">8. Offene Entscheide</w:t>
       </w:r>
     </w:p>
     <w:tbl>
@@ -4764,8 +6255,8 @@
       </w:tblPr>
       <w:tblGrid>
         <w:gridCol w:w="2400"/>
-        <w:gridCol w:w="3600"/>
-        <w:gridCol w:w="3026"/>
+        <w:gridCol w:w="4200"/>
+        <w:gridCol w:w="2426"/>
       </w:tblGrid>
       <w:tr>
         <w:tc>
@@ -4799,7 +6290,7 @@
         </w:tc>
         <w:tc>
           <w:tcPr>
-            <w:tcW w:type="dxa" w:w="3600"/>
+            <w:tcW w:type="dxa" w:w="4200"/>
             <w:tcBorders>
               <w:top w:val="single" w:color="BBCCDD" w:sz="1"/>
               <w:left w:val="single" w:color="BBCCDD" w:sz="1"/>
@@ -4828,7 +6319,7 @@
         </w:tc>
         <w:tc>
           <w:tcPr>
-            <w:tcW w:type="dxa" w:w="3026"/>
+            <w:tcW w:type="dxa" w:w="2426"/>
             <w:tcBorders>
               <w:top w:val="single" w:color="BBCCDD" w:sz="1"/>
               <w:left w:val="single" w:color="BBCCDD" w:sz="1"/>
@@ -4882,13 +6373,13 @@
                 <w:sz w:val="20"/>
                 <w:szCs w:val="20"/>
               </w:rPr>
-              <w:t xml:space="preserve">VPS-Anbieter</w:t>
-            </w:r>
-          </w:p>
-        </w:tc>
-        <w:tc>
-          <w:tcPr>
-            <w:tcW w:type="dxa" w:w="3600"/>
+              <w:t xml:space="preserve">Monitoring</w:t>
+            </w:r>
+          </w:p>
+        </w:tc>
+        <w:tc>
+          <w:tcPr>
+            <w:tcW w:type="dxa" w:w="4200"/>
             <w:tcBorders>
               <w:top w:val="single" w:color="BBCCDD" w:sz="1"/>
               <w:left w:val="single" w:color="BBCCDD" w:sz="1"/>
@@ -4911,13 +6402,13 @@
                 <w:sz w:val="20"/>
                 <w:szCs w:val="20"/>
               </w:rPr>
-              <w:t xml:space="preserve">Hetzner (DE) vs. Infomaniak (CH)</w:t>
-            </w:r>
-          </w:p>
-        </w:tc>
-        <w:tc>
-          <w:tcPr>
-            <w:tcW w:type="dxa" w:w="3026"/>
+              <w:t xml:space="preserve">Kein Monitoring vs. einfaches Uptime-Tool (z.B. Uptime Kuma, self-hosted)</w:t>
+            </w:r>
+          </w:p>
+        </w:tc>
+        <w:tc>
+          <w:tcPr>
+            <w:tcW w:type="dxa" w:w="2426"/>
             <w:tcBorders>
               <w:top w:val="single" w:color="BBCCDD" w:sz="1"/>
               <w:left w:val="single" w:color="BBCCDD" w:sz="1"/>
@@ -4940,7 +6431,7 @@
                 <w:sz w:val="20"/>
                 <w:szCs w:val="20"/>
               </w:rPr>
-              <w:t xml:space="preserve">Vor Deployment</w:t>
+              <w:t xml:space="preserve">Phase 2</w:t>
             </w:r>
           </w:p>
         </w:tc>
@@ -4971,13 +6462,13 @@
                 <w:sz w:val="20"/>
                 <w:szCs w:val="20"/>
               </w:rPr>
-              <w:t xml:space="preserve">Deployment-Methode</w:t>
-            </w:r>
-          </w:p>
-        </w:tc>
-        <w:tc>
-          <w:tcPr>
-            <w:tcW w:type="dxa" w:w="3600"/>
+              <w:t xml:space="preserve">E-Mail-Versand</w:t>
+            </w:r>
+          </w:p>
+        </w:tc>
+        <w:tc>
+          <w:tcPr>
+            <w:tcW w:type="dxa" w:w="4200"/>
             <w:tcBorders>
               <w:top w:val="single" w:color="BBCCDD" w:sz="1"/>
               <w:left w:val="single" w:color="BBCCDD" w:sz="1"/>
@@ -5000,191 +6491,13 @@
                 <w:sz w:val="20"/>
                 <w:szCs w:val="20"/>
               </w:rPr>
-              <w:t xml:space="preserve">Direkt auf VPS vs. Docker Compose</w:t>
-            </w:r>
-          </w:p>
-        </w:tc>
-        <w:tc>
-          <w:tcPr>
-            <w:tcW w:type="dxa" w:w="3026"/>
-            <w:tcBorders>
-              <w:top w:val="single" w:color="BBCCDD" w:sz="1"/>
-              <w:left w:val="single" w:color="BBCCDD" w:sz="1"/>
-              <w:bottom w:val="single" w:color="BBCCDD" w:sz="1"/>
-              <w:right w:val="single" w:color="BBCCDD" w:sz="1"/>
-            </w:tcBorders>
-            <w:shd w:fill="F5F8FB" w:val="clear"/>
-            <w:tcMar>
-              <w:top w:type="dxa" w:w="80"/>
-              <w:left w:type="dxa" w:w="120"/>
-              <w:bottom w:type="dxa" w:w="80"/>
-              <w:right w:type="dxa" w:w="120"/>
-            </w:tcMar>
-          </w:tcPr>
-          <w:p>
-            <w:r>
-              <w:rPr>
-                <w:b w:val="false"/>
-                <w:bCs w:val="false"/>
-                <w:sz w:val="20"/>
-                <w:szCs w:val="20"/>
-              </w:rPr>
-              <w:t xml:space="preserve">Vor erstem Deploy</w:t>
-            </w:r>
-          </w:p>
-        </w:tc>
-      </w:tr>
-      <w:tr>
-        <w:tc>
-          <w:tcPr>
-            <w:tcW w:type="dxa" w:w="2400"/>
-            <w:tcBorders>
-              <w:top w:val="single" w:color="BBCCDD" w:sz="1"/>
-              <w:left w:val="single" w:color="BBCCDD" w:sz="1"/>
-              <w:bottom w:val="single" w:color="BBCCDD" w:sz="1"/>
-              <w:right w:val="single" w:color="BBCCDD" w:sz="1"/>
-            </w:tcBorders>
-            <w:shd w:fill="FFFFFF" w:val="clear"/>
-            <w:tcMar>
-              <w:top w:type="dxa" w:w="80"/>
-              <w:left w:type="dxa" w:w="120"/>
-              <w:bottom w:type="dxa" w:w="80"/>
-              <w:right w:type="dxa" w:w="120"/>
-            </w:tcMar>
-          </w:tcPr>
-          <w:p>
-            <w:r>
-              <w:rPr>
-                <w:b w:val="false"/>
-                <w:bCs w:val="false"/>
-                <w:sz w:val="20"/>
-                <w:szCs w:val="20"/>
-              </w:rPr>
-              <w:t xml:space="preserve">Alembic vs. manuelles Schema</w:t>
-            </w:r>
-          </w:p>
-        </w:tc>
-        <w:tc>
-          <w:tcPr>
-            <w:tcW w:type="dxa" w:w="3600"/>
-            <w:tcBorders>
-              <w:top w:val="single" w:color="BBCCDD" w:sz="1"/>
-              <w:left w:val="single" w:color="BBCCDD" w:sz="1"/>
-              <w:bottom w:val="single" w:color="BBCCDD" w:sz="1"/>
-              <w:right w:val="single" w:color="BBCCDD" w:sz="1"/>
-            </w:tcBorders>
-            <w:shd w:fill="FFFFFF" w:val="clear"/>
-            <w:tcMar>
-              <w:top w:type="dxa" w:w="80"/>
-              <w:left w:type="dxa" w:w="120"/>
-              <w:bottom w:type="dxa" w:w="80"/>
-              <w:right w:type="dxa" w:w="120"/>
-            </w:tcMar>
-          </w:tcPr>
-          <w:p>
-            <w:r>
-              <w:rPr>
-                <w:b w:val="false"/>
-                <w:bCs w:val="false"/>
-                <w:sz w:val="20"/>
-                <w:szCs w:val="20"/>
-              </w:rPr>
-              <w:t xml:space="preserve">Migrationen via Alembic (empfohlen) oder manuell</w:t>
-            </w:r>
-          </w:p>
-        </w:tc>
-        <w:tc>
-          <w:tcPr>
-            <w:tcW w:type="dxa" w:w="3026"/>
-            <w:tcBorders>
-              <w:top w:val="single" w:color="BBCCDD" w:sz="1"/>
-              <w:left w:val="single" w:color="BBCCDD" w:sz="1"/>
-              <w:bottom w:val="single" w:color="BBCCDD" w:sz="1"/>
-              <w:right w:val="single" w:color="BBCCDD" w:sz="1"/>
-            </w:tcBorders>
-            <w:shd w:fill="FFFFFF" w:val="clear"/>
-            <w:tcMar>
-              <w:top w:type="dxa" w:w="80"/>
-              <w:left w:type="dxa" w:w="120"/>
-              <w:bottom w:type="dxa" w:w="80"/>
-              <w:right w:type="dxa" w:w="120"/>
-            </w:tcMar>
-          </w:tcPr>
-          <w:p>
-            <w:r>
-              <w:rPr>
-                <w:b w:val="false"/>
-                <w:bCs w:val="false"/>
-                <w:sz w:val="20"/>
-                <w:szCs w:val="20"/>
-              </w:rPr>
-              <w:t xml:space="preserve">Vor erstem Deploy</w:t>
-            </w:r>
-          </w:p>
-        </w:tc>
-      </w:tr>
-      <w:tr>
-        <w:tc>
-          <w:tcPr>
-            <w:tcW w:type="dxa" w:w="2400"/>
-            <w:tcBorders>
-              <w:top w:val="single" w:color="BBCCDD" w:sz="1"/>
-              <w:left w:val="single" w:color="BBCCDD" w:sz="1"/>
-              <w:bottom w:val="single" w:color="BBCCDD" w:sz="1"/>
-              <w:right w:val="single" w:color="BBCCDD" w:sz="1"/>
-            </w:tcBorders>
-            <w:shd w:fill="F5F8FB" w:val="clear"/>
-            <w:tcMar>
-              <w:top w:type="dxa" w:w="80"/>
-              <w:left w:type="dxa" w:w="120"/>
-              <w:bottom w:type="dxa" w:w="80"/>
-              <w:right w:type="dxa" w:w="120"/>
-            </w:tcMar>
-          </w:tcPr>
-          <w:p>
-            <w:r>
-              <w:rPr>
-                <w:b w:val="false"/>
-                <w:bCs w:val="false"/>
-                <w:sz w:val="20"/>
-                <w:szCs w:val="20"/>
-              </w:rPr>
-              <w:t xml:space="preserve">Backup-Destination</w:t>
-            </w:r>
-          </w:p>
-        </w:tc>
-        <w:tc>
-          <w:tcPr>
-            <w:tcW w:type="dxa" w:w="3600"/>
-            <w:tcBorders>
-              <w:top w:val="single" w:color="BBCCDD" w:sz="1"/>
-              <w:left w:val="single" w:color="BBCCDD" w:sz="1"/>
-              <w:bottom w:val="single" w:color="BBCCDD" w:sz="1"/>
-              <w:right w:val="single" w:color="BBCCDD" w:sz="1"/>
-            </w:tcBorders>
-            <w:shd w:fill="F5F8FB" w:val="clear"/>
-            <w:tcMar>
-              <w:top w:type="dxa" w:w="80"/>
-              <w:left w:type="dxa" w:w="120"/>
-              <w:bottom w:type="dxa" w:w="80"/>
-              <w:right w:type="dxa" w:w="120"/>
-            </w:tcMar>
-          </w:tcPr>
-          <w:p>
-            <w:r>
-              <w:rPr>
-                <w:b w:val="false"/>
-                <w:bCs w:val="false"/>
-                <w:sz w:val="20"/>
-                <w:szCs w:val="20"/>
-              </w:rPr>
-              <w:t xml:space="preserve">Lokal auf VPS vs. zusätzlich S3-kompatibel (z.B. Infomaniak kDrive)</w:t>
-            </w:r>
-          </w:p>
-        </w:tc>
-        <w:tc>
-          <w:tcPr>
-            <w:tcW w:type="dxa" w:w="3026"/>
+              <w:t xml:space="preserve">Kein Mail (MVP) vs. Infomaniak SMTP für Benachrichtigungen</w:t>
+            </w:r>
+          </w:p>
+        </w:tc>
+        <w:tc>
+          <w:tcPr>
+            <w:tcW w:type="dxa" w:w="2426"/>
             <w:tcBorders>
               <w:top w:val="single" w:color="BBCCDD" w:sz="1"/>
               <w:left w:val="single" w:color="BBCCDD" w:sz="1"/>
@@ -5237,7 +6550,7 @@
           <w:sz w:val="18"/>
           <w:szCs w:val="18"/>
         </w:rPr>
-        <w:t xml:space="preserve">Architekturübersicht V1.0  |  Erstellt mit KI-Unterstützung (Claude, Anthropic)</w:t>
+        <w:t xml:space="preserve">Architekturübersicht V1.2  |  Erstellt mit KI-Unterstützung (Claude, Anthropic)</w:t>
       </w:r>
     </w:p>
     <w:sectPr>

</xml_diff>

<commit_message>
docs: Architekturübersicht V1.3 – Rate-Limiting und offene Sicherheitspunkte
</commit_message>
<xml_diff>
--- a/docs/Architekturuebersicht.docx
+++ b/docs/Architekturuebersicht.docx
@@ -45,7 +45,7 @@
           <w:sz w:val="22"/>
           <w:szCs w:val="22"/>
         </w:rPr>
-        <w:t xml:space="preserve">Version 1.2 – Backup-Strategie ergänzt</w:t>
+        <w:t xml:space="preserve">Version 1.3 – Security-Review eingearbeitet</w:t>
       </w:r>
     </w:p>
     <w:p>
@@ -4284,7 +4284,7 @@
                 <w:sz w:val="20"/>
                 <w:szCs w:val="20"/>
               </w:rPr>
-              <w:t xml:space="preserve">nginx: Login-Endpunkt begrenzt (z.B. 5 req/min)</w:t>
+              <w:t xml:space="preserve">nginx: Login 5 req/min, /calendar/public 60 req/min, Standard 300 req/min (pro IP)</w:t>
             </w:r>
           </w:p>
         </w:tc>
@@ -6255,8 +6255,8 @@
       </w:tblPr>
       <w:tblGrid>
         <w:gridCol w:w="2400"/>
-        <w:gridCol w:w="4200"/>
-        <w:gridCol w:w="2426"/>
+        <w:gridCol w:w="4000"/>
+        <w:gridCol w:w="2626"/>
       </w:tblGrid>
       <w:tr>
         <w:tc>
@@ -6290,7 +6290,7 @@
         </w:tc>
         <w:tc>
           <w:tcPr>
-            <w:tcW w:type="dxa" w:w="4200"/>
+            <w:tcW w:type="dxa" w:w="4000"/>
             <w:tcBorders>
               <w:top w:val="single" w:color="BBCCDD" w:sz="1"/>
               <w:left w:val="single" w:color="BBCCDD" w:sz="1"/>
@@ -6319,7 +6319,7 @@
         </w:tc>
         <w:tc>
           <w:tcPr>
-            <w:tcW w:type="dxa" w:w="2426"/>
+            <w:tcW w:type="dxa" w:w="2626"/>
             <w:tcBorders>
               <w:top w:val="single" w:color="BBCCDD" w:sz="1"/>
               <w:left w:val="single" w:color="BBCCDD" w:sz="1"/>
@@ -6379,7 +6379,7 @@
         </w:tc>
         <w:tc>
           <w:tcPr>
-            <w:tcW w:type="dxa" w:w="4200"/>
+            <w:tcW w:type="dxa" w:w="4000"/>
             <w:tcBorders>
               <w:top w:val="single" w:color="BBCCDD" w:sz="1"/>
               <w:left w:val="single" w:color="BBCCDD" w:sz="1"/>
@@ -6408,7 +6408,7 @@
         </w:tc>
         <w:tc>
           <w:tcPr>
-            <w:tcW w:type="dxa" w:w="2426"/>
+            <w:tcW w:type="dxa" w:w="2626"/>
             <w:tcBorders>
               <w:top w:val="single" w:color="BBCCDD" w:sz="1"/>
               <w:left w:val="single" w:color="BBCCDD" w:sz="1"/>
@@ -6468,7 +6468,7 @@
         </w:tc>
         <w:tc>
           <w:tcPr>
-            <w:tcW w:type="dxa" w:w="4200"/>
+            <w:tcW w:type="dxa" w:w="4000"/>
             <w:tcBorders>
               <w:top w:val="single" w:color="BBCCDD" w:sz="1"/>
               <w:left w:val="single" w:color="BBCCDD" w:sz="1"/>
@@ -6497,7 +6497,185 @@
         </w:tc>
         <w:tc>
           <w:tcPr>
-            <w:tcW w:type="dxa" w:w="2426"/>
+            <w:tcW w:type="dxa" w:w="2626"/>
+            <w:tcBorders>
+              <w:top w:val="single" w:color="BBCCDD" w:sz="1"/>
+              <w:left w:val="single" w:color="BBCCDD" w:sz="1"/>
+              <w:bottom w:val="single" w:color="BBCCDD" w:sz="1"/>
+              <w:right w:val="single" w:color="BBCCDD" w:sz="1"/>
+            </w:tcBorders>
+            <w:shd w:fill="F5F8FB" w:val="clear"/>
+            <w:tcMar>
+              <w:top w:type="dxa" w:w="80"/>
+              <w:left w:type="dxa" w:w="120"/>
+              <w:bottom w:type="dxa" w:w="80"/>
+              <w:right w:type="dxa" w:w="120"/>
+            </w:tcMar>
+          </w:tcPr>
+          <w:p>
+            <w:r>
+              <w:rPr>
+                <w:b w:val="false"/>
+                <w:bCs w:val="false"/>
+                <w:sz w:val="20"/>
+                <w:szCs w:val="20"/>
+              </w:rPr>
+              <w:t xml:space="preserve">Phase 2</w:t>
+            </w:r>
+          </w:p>
+        </w:tc>
+      </w:tr>
+      <w:tr>
+        <w:tc>
+          <w:tcPr>
+            <w:tcW w:type="dxa" w:w="2400"/>
+            <w:tcBorders>
+              <w:top w:val="single" w:color="BBCCDD" w:sz="1"/>
+              <w:left w:val="single" w:color="BBCCDD" w:sz="1"/>
+              <w:bottom w:val="single" w:color="BBCCDD" w:sz="1"/>
+              <w:right w:val="single" w:color="BBCCDD" w:sz="1"/>
+            </w:tcBorders>
+            <w:shd w:fill="FFFFFF" w:val="clear"/>
+            <w:tcMar>
+              <w:top w:type="dxa" w:w="80"/>
+              <w:left w:type="dxa" w:w="120"/>
+              <w:bottom w:type="dxa" w:w="80"/>
+              <w:right w:type="dxa" w:w="120"/>
+            </w:tcMar>
+          </w:tcPr>
+          <w:p>
+            <w:r>
+              <w:rPr>
+                <w:b w:val="false"/>
+                <w:bCs w:val="false"/>
+                <w:sz w:val="20"/>
+                <w:szCs w:val="20"/>
+              </w:rPr>
+              <w:t xml:space="preserve">Refresh-Token-Revocation</w:t>
+            </w:r>
+          </w:p>
+        </w:tc>
+        <w:tc>
+          <w:tcPr>
+            <w:tcW w:type="dxa" w:w="4000"/>
+            <w:tcBorders>
+              <w:top w:val="single" w:color="BBCCDD" w:sz="1"/>
+              <w:left w:val="single" w:color="BBCCDD" w:sz="1"/>
+              <w:bottom w:val="single" w:color="BBCCDD" w:sz="1"/>
+              <w:right w:val="single" w:color="BBCCDD" w:sz="1"/>
+            </w:tcBorders>
+            <w:shd w:fill="FFFFFF" w:val="clear"/>
+            <w:tcMar>
+              <w:top w:type="dxa" w:w="80"/>
+              <w:left w:type="dxa" w:w="120"/>
+              <w:bottom w:type="dxa" w:w="80"/>
+              <w:right w:type="dxa" w:w="120"/>
+            </w:tcMar>
+          </w:tcPr>
+          <w:p>
+            <w:r>
+              <w:rPr>
+                <w:b w:val="false"/>
+                <w:bCs w:val="false"/>
+                <w:sz w:val="20"/>
+                <w:szCs w:val="20"/>
+              </w:rPr>
+              <w:t xml:space="preserve">Token-Blacklist in PostgreSQL (Tabelle revoked_tokens)</w:t>
+            </w:r>
+          </w:p>
+        </w:tc>
+        <w:tc>
+          <w:tcPr>
+            <w:tcW w:type="dxa" w:w="2626"/>
+            <w:tcBorders>
+              <w:top w:val="single" w:color="BBCCDD" w:sz="1"/>
+              <w:left w:val="single" w:color="BBCCDD" w:sz="1"/>
+              <w:bottom w:val="single" w:color="BBCCDD" w:sz="1"/>
+              <w:right w:val="single" w:color="BBCCDD" w:sz="1"/>
+            </w:tcBorders>
+            <w:shd w:fill="FFFFFF" w:val="clear"/>
+            <w:tcMar>
+              <w:top w:type="dxa" w:w="80"/>
+              <w:left w:type="dxa" w:w="120"/>
+              <w:bottom w:type="dxa" w:w="80"/>
+              <w:right w:type="dxa" w:w="120"/>
+            </w:tcMar>
+          </w:tcPr>
+          <w:p>
+            <w:r>
+              <w:rPr>
+                <w:b w:val="false"/>
+                <w:bCs w:val="false"/>
+                <w:sz w:val="20"/>
+                <w:szCs w:val="20"/>
+              </w:rPr>
+              <w:t xml:space="preserve">Phase 2</w:t>
+            </w:r>
+          </w:p>
+        </w:tc>
+      </w:tr>
+      <w:tr>
+        <w:tc>
+          <w:tcPr>
+            <w:tcW w:type="dxa" w:w="2400"/>
+            <w:tcBorders>
+              <w:top w:val="single" w:color="BBCCDD" w:sz="1"/>
+              <w:left w:val="single" w:color="BBCCDD" w:sz="1"/>
+              <w:bottom w:val="single" w:color="BBCCDD" w:sz="1"/>
+              <w:right w:val="single" w:color="BBCCDD" w:sz="1"/>
+            </w:tcBorders>
+            <w:shd w:fill="F5F8FB" w:val="clear"/>
+            <w:tcMar>
+              <w:top w:type="dxa" w:w="80"/>
+              <w:left w:type="dxa" w:w="120"/>
+              <w:bottom w:type="dxa" w:w="80"/>
+              <w:right w:type="dxa" w:w="120"/>
+            </w:tcMar>
+          </w:tcPr>
+          <w:p>
+            <w:r>
+              <w:rPr>
+                <w:b w:val="false"/>
+                <w:bCs w:val="false"/>
+                <w:sz w:val="20"/>
+                <w:szCs w:val="20"/>
+              </w:rPr>
+              <w:t xml:space="preserve">Accountsperrung</w:t>
+            </w:r>
+          </w:p>
+        </w:tc>
+        <w:tc>
+          <w:tcPr>
+            <w:tcW w:type="dxa" w:w="4000"/>
+            <w:tcBorders>
+              <w:top w:val="single" w:color="BBCCDD" w:sz="1"/>
+              <w:left w:val="single" w:color="BBCCDD" w:sz="1"/>
+              <w:bottom w:val="single" w:color="BBCCDD" w:sz="1"/>
+              <w:right w:val="single" w:color="BBCCDD" w:sz="1"/>
+            </w:tcBorders>
+            <w:shd w:fill="F5F8FB" w:val="clear"/>
+            <w:tcMar>
+              <w:top w:type="dxa" w:w="80"/>
+              <w:left w:type="dxa" w:w="120"/>
+              <w:bottom w:type="dxa" w:w="80"/>
+              <w:right w:type="dxa" w:w="120"/>
+            </w:tcMar>
+          </w:tcPr>
+          <w:p>
+            <w:r>
+              <w:rPr>
+                <w:b w:val="false"/>
+                <w:bCs w:val="false"/>
+                <w:sz w:val="20"/>
+                <w:szCs w:val="20"/>
+              </w:rPr>
+              <w:t xml:space="preserve">Nach X Login-Fehlversuchen sperren (MVP: nur Rate-Limiting)</w:t>
+            </w:r>
+          </w:p>
+        </w:tc>
+        <w:tc>
+          <w:tcPr>
+            <w:tcW w:type="dxa" w:w="2626"/>
             <w:tcBorders>
               <w:top w:val="single" w:color="BBCCDD" w:sz="1"/>
               <w:left w:val="single" w:color="BBCCDD" w:sz="1"/>

</xml_diff>